<commit_message>
thirdAttempt: full 13-domain deliverables (phase-1 8 + remaining 5)
- restores attachment, discussion, sample, search, workspace:
  initial-analysis sources + their code/ snapshot files
- same conventions as secondAttempt applied to the restored domains:
  point-by-point bullets, Engineer/Product Owner personas, no ADR
  references, source-repo code paths (.js/.graphqls), fixed links
- generators extended to all 13 domains; spike table restored to full
  domain coverage; program decisions include the returning domains
- jira: one shared epic + 337 stories + 6 program spikes; compact
  "family" stories (search C04-C10) now get Summary/Covers/AC fallback
  descriptions instead of empty ones
- complexStories briefs: later-phase tags removed (all domains in scope)

Regenerate: cd fedMigrationScripts/generatescripts && python generate_all.py

Co-Authored-By: Claude Fable 5 <noreply@anthropic.com>
</commit_message>
<xml_diff>
--- a/output/summary/Federated+Graphql+Stories+-+BreakDown.docx
+++ b/output/summary/Federated+Graphql+Stories+-+BreakDown.docx
@@ -22,7 +22,7 @@
           <w:color w:val="444444"/>
           <w:sz w:val="22"/>
         </w:rPr>
-        <w:t>Generated: 2026-07-07  ·  8 domains  ·  spark-internal-graphql → Netflix DGS via Hive Schema Registry</w:t>
+        <w:t>Generated: 2026-07-07  ·  13 domains  ·  spark-internal-graphql → Netflix DGS via Hive Schema Registry</w:t>
       </w:r>
     </w:p>
     <w:tbl>
@@ -121,7 +121,7 @@
                 <w:color w:val="373737"/>
                 <w:sz w:val="18"/>
               </w:rPr>
-              <w:t>8</w:t>
+              <w:t>13</w:t>
             </w:r>
           </w:p>
         </w:tc>
@@ -161,7 +161,7 @@
                 <w:color w:val="373737"/>
                 <w:sz w:val="18"/>
               </w:rPr>
-              <w:t>2</w:t>
+              <w:t>7</w:t>
             </w:r>
           </w:p>
         </w:tc>
@@ -199,7 +199,7 @@
                 <w:color w:val="373737"/>
                 <w:sz w:val="18"/>
               </w:rPr>
-              <w:t>200</w:t>
+              <w:t>337</w:t>
             </w:r>
           </w:p>
         </w:tc>
@@ -239,7 +239,7 @@
                 <w:color w:val="373737"/>
                 <w:sz w:val="18"/>
               </w:rPr>
-              <w:t>🔴 6 Very High · 🟠 13 High · 🟡 76 Medium · 🟢 105 Low</w:t>
+              <w:t>🔴 9 Very High · 🟠 34 High · 🟡 140 Medium · 🟢 154 Low</w:t>
             </w:r>
           </w:p>
         </w:tc>
@@ -2476,6 +2476,20 @@
                 <w:color w:val="373737"/>
                 <w:sz w:val="18"/>
               </w:rPr>
+              <w:t xml:space="preserve"> · sample </w:t>
+            </w:r>
+            <w:r>
+              <w:rPr>
+                <w:rFonts w:ascii="Courier New" w:hAnsi="Courier New"/>
+                <w:sz w:val="18"/>
+              </w:rPr>
+              <w:t>E01/E02</w:t>
+            </w:r>
+            <w:r>
+              <w:rPr>
+                <w:color w:val="373737"/>
+                <w:sz w:val="18"/>
+              </w:rPr>
               <w:t xml:space="preserve"> · watchlist </w:t>
             </w:r>
             <w:r>
@@ -2484,6 +2498,20 @@
                 <w:sz w:val="18"/>
               </w:rPr>
               <w:t>E01</w:t>
+            </w:r>
+            <w:r>
+              <w:rPr>
+                <w:color w:val="373737"/>
+                <w:sz w:val="18"/>
+              </w:rPr>
+              <w:t xml:space="preserve"> · discussion </w:t>
+            </w:r>
+            <w:r>
+              <w:rPr>
+                <w:rFonts w:ascii="Courier New" w:hAnsi="Courier New"/>
+                <w:sz w:val="18"/>
+              </w:rPr>
+              <w:t>E01/E02</w:t>
             </w:r>
             <w:r>
               <w:rPr>
@@ -2861,6 +2889,13 @@
               </w:rPr>
               <w:t>E01</w:t>
             </w:r>
+            <w:r>
+              <w:rPr>
+                <w:color w:val="373737"/>
+                <w:sz w:val="18"/>
+              </w:rPr>
+              <w:t xml:space="preserve"> · attachment · discussion · sample</w:t>
+            </w:r>
           </w:p>
         </w:tc>
         <w:tc>
@@ -3208,6 +3243,48 @@
               </w:rPr>
               <w:t>A04</w:t>
             </w:r>
+            <w:r>
+              <w:rPr>
+                <w:color w:val="373737"/>
+                <w:sz w:val="18"/>
+              </w:rPr>
+              <w:t xml:space="preserve"> · sample </w:t>
+            </w:r>
+            <w:r>
+              <w:rPr>
+                <w:rFonts w:ascii="Courier New" w:hAnsi="Courier New"/>
+                <w:sz w:val="18"/>
+              </w:rPr>
+              <w:t>B01</w:t>
+            </w:r>
+            <w:r>
+              <w:rPr>
+                <w:color w:val="373737"/>
+                <w:sz w:val="18"/>
+              </w:rPr>
+              <w:t xml:space="preserve"> (</w:t>
+            </w:r>
+            <w:r>
+              <w:rPr>
+                <w:rFonts w:ascii="Courier New" w:hAnsi="Courier New"/>
+                <w:sz w:val="18"/>
+              </w:rPr>
+              <w:t>SampleAsset</w:t>
+            </w:r>
+            <w:r>
+              <w:rPr>
+                <w:color w:val="373737"/>
+                <w:sz w:val="18"/>
+              </w:rPr>
+              <w:t xml:space="preserve"> union) · search </w:t>
+            </w:r>
+            <w:r>
+              <w:rPr>
+                <w:rFonts w:ascii="Courier New" w:hAnsi="Courier New"/>
+                <w:sz w:val="18"/>
+              </w:rPr>
+              <w:t>A02</w:t>
+            </w:r>
           </w:p>
         </w:tc>
         <w:tc>
@@ -3362,7 +3439,21 @@
                 <w:color w:val="373737"/>
                 <w:sz w:val="18"/>
               </w:rPr>
-              <w:t xml:space="preserve"> · bom (material rollout)</w:t>
+              <w:t xml:space="preserve"> · workspace </w:t>
+            </w:r>
+            <w:r>
+              <w:rPr>
+                <w:rFonts w:ascii="Courier New" w:hAnsi="Courier New"/>
+                <w:sz w:val="18"/>
+              </w:rPr>
+              <w:t>D04/G04</w:t>
+            </w:r>
+            <w:r>
+              <w:rPr>
+                <w:color w:val="373737"/>
+                <w:sz w:val="18"/>
+              </w:rPr>
+              <w:t xml:space="preserve"> · search (read-hub order) · bom (material rollout)</w:t>
             </w:r>
           </w:p>
         </w:tc>
@@ -4535,7 +4626,7 @@
                 <w:color w:val="373737"/>
                 <w:sz w:val="18"/>
               </w:rPr>
-              <w:t>Bill of Materials (BOM)</w:t>
+              <w:t>Attachment</w:t>
             </w:r>
           </w:p>
         </w:tc>
@@ -4553,7 +4644,7 @@
                 <w:color w:val="373737"/>
                 <w:sz w:val="18"/>
               </w:rPr>
-              <w:t>plm-product (co-located)</w:t>
+              <w:t>plm-attachment (separate)</w:t>
             </w:r>
           </w:p>
         </w:tc>
@@ -4571,7 +4662,7 @@
                 <w:color w:val="373737"/>
                 <w:sz w:val="18"/>
               </w:rPr>
-              <w:t>XL</w:t>
+              <w:t>L</w:t>
             </w:r>
           </w:p>
         </w:tc>
@@ -4589,7 +4680,7 @@
                 <w:color w:val="373737"/>
                 <w:sz w:val="18"/>
               </w:rPr>
-              <w:t>36</w:t>
+              <w:t>24</w:t>
             </w:r>
           </w:p>
         </w:tc>
@@ -4607,7 +4698,7 @@
                 <w:color w:val="373737"/>
                 <w:sz w:val="18"/>
               </w:rPr>
-              <w:t>1</w:t>
+              <w:t>0</w:t>
             </w:r>
           </w:p>
         </w:tc>
@@ -4643,7 +4734,7 @@
                 <w:color w:val="373737"/>
                 <w:sz w:val="18"/>
               </w:rPr>
-              <w:t>12</w:t>
+              <w:t>14</w:t>
             </w:r>
           </w:p>
         </w:tc>
@@ -4661,7 +4752,7 @@
                 <w:color w:val="373737"/>
                 <w:sz w:val="18"/>
               </w:rPr>
-              <w:t>21</w:t>
+              <w:t>8</w:t>
             </w:r>
           </w:p>
         </w:tc>
@@ -4679,7 +4770,7 @@
                 <w:color w:val="373737"/>
                 <w:sz w:val="18"/>
               </w:rPr>
-              <w:t>FederatedGqlBrakDown-bom</w:t>
+              <w:t>FederatedGqlBrakDown-attachment</w:t>
             </w:r>
           </w:p>
         </w:tc>
@@ -4719,7 +4810,7 @@
                 <w:color w:val="373737"/>
                 <w:sz w:val="18"/>
               </w:rPr>
-              <w:t>Claims</w:t>
+              <w:t>Bill of Materials (BOM)</w:t>
             </w:r>
           </w:p>
         </w:tc>
@@ -4738,7 +4829,7 @@
                 <w:color w:val="373737"/>
                 <w:sz w:val="18"/>
               </w:rPr>
-              <w:t>spark-claims (separate)</w:t>
+              <w:t>plm-product (co-located)</w:t>
             </w:r>
           </w:p>
         </w:tc>
@@ -4757,7 +4848,7 @@
                 <w:color w:val="373737"/>
                 <w:sz w:val="18"/>
               </w:rPr>
-              <w:t>L</w:t>
+              <w:t>XL</w:t>
             </w:r>
           </w:p>
         </w:tc>
@@ -4776,7 +4867,7 @@
                 <w:color w:val="373737"/>
                 <w:sz w:val="18"/>
               </w:rPr>
-              <w:t>20</w:t>
+              <w:t>36</w:t>
             </w:r>
           </w:p>
         </w:tc>
@@ -4795,7 +4886,7 @@
                 <w:color w:val="373737"/>
                 <w:sz w:val="18"/>
               </w:rPr>
-              <w:t>0</w:t>
+              <w:t>1</w:t>
             </w:r>
           </w:p>
         </w:tc>
@@ -4833,7 +4924,7 @@
                 <w:color w:val="373737"/>
                 <w:sz w:val="18"/>
               </w:rPr>
-              <w:t>9</w:t>
+              <w:t>12</w:t>
             </w:r>
           </w:p>
         </w:tc>
@@ -4852,7 +4943,7 @@
                 <w:color w:val="373737"/>
                 <w:sz w:val="18"/>
               </w:rPr>
-              <w:t>9</w:t>
+              <w:t>21</w:t>
             </w:r>
           </w:p>
         </w:tc>
@@ -4871,7 +4962,7 @@
                 <w:color w:val="373737"/>
                 <w:sz w:val="18"/>
               </w:rPr>
-              <w:t>FederatedGqlBrakDown-claims</w:t>
+              <w:t>FederatedGqlBrakDown-bom</w:t>
             </w:r>
           </w:p>
         </w:tc>
@@ -4909,7 +5000,7 @@
                 <w:color w:val="373737"/>
                 <w:sz w:val="18"/>
               </w:rPr>
-              <w:t>Impression</w:t>
+              <w:t>Claims</w:t>
             </w:r>
           </w:p>
         </w:tc>
@@ -4927,7 +5018,7 @@
                 <w:color w:val="373737"/>
                 <w:sz w:val="18"/>
               </w:rPr>
-              <w:t>plm-product (co-located)</w:t>
+              <w:t>spark-claims (separate)</w:t>
             </w:r>
           </w:p>
         </w:tc>
@@ -4945,7 +5036,7 @@
                 <w:color w:val="373737"/>
                 <w:sz w:val="18"/>
               </w:rPr>
-              <w:t>XS</w:t>
+              <w:t>L</w:t>
             </w:r>
           </w:p>
         </w:tc>
@@ -4963,7 +5054,7 @@
                 <w:color w:val="373737"/>
                 <w:sz w:val="18"/>
               </w:rPr>
-              <w:t>7</w:t>
+              <w:t>20</w:t>
             </w:r>
           </w:p>
         </w:tc>
@@ -4999,7 +5090,7 @@
                 <w:color w:val="373737"/>
                 <w:sz w:val="18"/>
               </w:rPr>
-              <w:t>0</w:t>
+              <w:t>2</w:t>
             </w:r>
           </w:p>
         </w:tc>
@@ -5017,7 +5108,7 @@
                 <w:color w:val="373737"/>
                 <w:sz w:val="18"/>
               </w:rPr>
-              <w:t>2</w:t>
+              <w:t>9</w:t>
             </w:r>
           </w:p>
         </w:tc>
@@ -5035,7 +5126,7 @@
                 <w:color w:val="373737"/>
                 <w:sz w:val="18"/>
               </w:rPr>
-              <w:t>5</w:t>
+              <w:t>9</w:t>
             </w:r>
           </w:p>
         </w:tc>
@@ -5053,7 +5144,7 @@
                 <w:color w:val="373737"/>
                 <w:sz w:val="18"/>
               </w:rPr>
-              <w:t>FederatedGqlBrakDown-impression</w:t>
+              <w:t>FederatedGqlBrakDown-claims</w:t>
             </w:r>
           </w:p>
         </w:tc>
@@ -5093,7 +5184,7 @@
                 <w:color w:val="373737"/>
                 <w:sz w:val="18"/>
               </w:rPr>
-              <w:t>Measurement</w:t>
+              <w:t>Discussion</w:t>
             </w:r>
           </w:p>
         </w:tc>
@@ -5112,7 +5203,7 @@
                 <w:color w:val="373737"/>
                 <w:sz w:val="18"/>
               </w:rPr>
-              <w:t>plm-product (co-located)</w:t>
+              <w:t>plm-discussion (separate)</w:t>
             </w:r>
           </w:p>
         </w:tc>
@@ -5131,7 +5222,7 @@
                 <w:color w:val="373737"/>
                 <w:sz w:val="18"/>
               </w:rPr>
-              <w:t>M</w:t>
+              <w:t>XL</w:t>
             </w:r>
           </w:p>
         </w:tc>
@@ -5150,7 +5241,7 @@
                 <w:color w:val="373737"/>
                 <w:sz w:val="18"/>
               </w:rPr>
-              <w:t>20</w:t>
+              <w:t>32</w:t>
             </w:r>
           </w:p>
         </w:tc>
@@ -5188,7 +5279,7 @@
                 <w:color w:val="373737"/>
                 <w:sz w:val="18"/>
               </w:rPr>
-              <w:t>1</w:t>
+              <w:t>4</w:t>
             </w:r>
           </w:p>
         </w:tc>
@@ -5207,7 +5298,7 @@
                 <w:color w:val="373737"/>
                 <w:sz w:val="18"/>
               </w:rPr>
-              <w:t>6</w:t>
+              <w:t>15</w:t>
             </w:r>
           </w:p>
         </w:tc>
@@ -5245,7 +5336,7 @@
                 <w:color w:val="373737"/>
                 <w:sz w:val="18"/>
               </w:rPr>
-              <w:t>FederatedGqlBrakDown-measurement</w:t>
+              <w:t>FederatedGqlBrakDown-discussion</w:t>
             </w:r>
           </w:p>
         </w:tc>
@@ -5283,7 +5374,7 @@
                 <w:color w:val="373737"/>
                 <w:sz w:val="18"/>
               </w:rPr>
-              <w:t>Packaging</w:t>
+              <w:t>Impression</w:t>
             </w:r>
           </w:p>
         </w:tc>
@@ -5319,7 +5410,7 @@
                 <w:color w:val="373737"/>
                 <w:sz w:val="18"/>
               </w:rPr>
-              <w:t>L</w:t>
+              <w:t>XS</w:t>
             </w:r>
           </w:p>
         </w:tc>
@@ -5337,7 +5428,7 @@
                 <w:color w:val="373737"/>
                 <w:sz w:val="18"/>
               </w:rPr>
-              <w:t>24</w:t>
+              <w:t>7</w:t>
             </w:r>
           </w:p>
         </w:tc>
@@ -5373,6 +5464,24 @@
                 <w:color w:val="373737"/>
                 <w:sz w:val="18"/>
               </w:rPr>
+              <w:t>0</w:t>
+            </w:r>
+          </w:p>
+        </w:tc>
+        <w:tc>
+          <w:tcPr>
+            <w:vAlign w:val="top"/>
+            <w:tcW w:w="648" w:type="dxa"/>
+          </w:tcPr>
+          <w:p>
+            <w:pPr>
+              <w:jc w:val="left"/>
+            </w:pPr>
+            <w:r>
+              <w:rPr>
+                <w:color w:val="373737"/>
+                <w:sz w:val="18"/>
+              </w:rPr>
               <w:t>2</w:t>
             </w:r>
           </w:p>
@@ -5391,25 +5500,7 @@
                 <w:color w:val="373737"/>
                 <w:sz w:val="18"/>
               </w:rPr>
-              <w:t>9</w:t>
-            </w:r>
-          </w:p>
-        </w:tc>
-        <w:tc>
-          <w:tcPr>
-            <w:vAlign w:val="top"/>
-            <w:tcW w:w="648" w:type="dxa"/>
-          </w:tcPr>
-          <w:p>
-            <w:pPr>
-              <w:jc w:val="left"/>
-            </w:pPr>
-            <w:r>
-              <w:rPr>
-                <w:color w:val="373737"/>
-                <w:sz w:val="18"/>
-              </w:rPr>
-              <w:t>13</w:t>
+              <w:t>5</w:t>
             </w:r>
           </w:p>
         </w:tc>
@@ -5427,7 +5518,7 @@
                 <w:color w:val="373737"/>
                 <w:sz w:val="18"/>
               </w:rPr>
-              <w:t>FederatedGqlBrakDown-packaging</w:t>
+              <w:t>FederatedGqlBrakDown-impression</w:t>
             </w:r>
           </w:p>
         </w:tc>
@@ -5467,7 +5558,7 @@
                 <w:color w:val="373737"/>
                 <w:sz w:val="18"/>
               </w:rPr>
-              <w:t>Product</w:t>
+              <w:t>Measurement</w:t>
             </w:r>
           </w:p>
         </w:tc>
@@ -5486,7 +5577,7 @@
                 <w:color w:val="373737"/>
                 <w:sz w:val="18"/>
               </w:rPr>
-              <w:t>plm-product (host)</w:t>
+              <w:t>plm-product (co-located)</w:t>
             </w:r>
           </w:p>
         </w:tc>
@@ -5505,7 +5596,7 @@
                 <w:color w:val="373737"/>
                 <w:sz w:val="18"/>
               </w:rPr>
-              <w:t>XXL</w:t>
+              <w:t>M</w:t>
             </w:r>
           </w:p>
         </w:tc>
@@ -5524,7 +5615,7 @@
                 <w:color w:val="373737"/>
                 <w:sz w:val="18"/>
               </w:rPr>
-              <w:t>67</w:t>
+              <w:t>20</w:t>
             </w:r>
           </w:p>
         </w:tc>
@@ -5543,7 +5634,7 @@
                 <w:color w:val="373737"/>
                 <w:sz w:val="18"/>
               </w:rPr>
-              <w:t>5</w:t>
+              <w:t>0</w:t>
             </w:r>
           </w:p>
         </w:tc>
@@ -5562,7 +5653,7 @@
                 <w:color w:val="373737"/>
                 <w:sz w:val="18"/>
               </w:rPr>
-              <w:t>4</w:t>
+              <w:t>1</w:t>
             </w:r>
           </w:p>
         </w:tc>
@@ -5581,7 +5672,7 @@
                 <w:color w:val="373737"/>
                 <w:sz w:val="18"/>
               </w:rPr>
-              <w:t>25</w:t>
+              <w:t>6</w:t>
             </w:r>
           </w:p>
         </w:tc>
@@ -5600,7 +5691,7 @@
                 <w:color w:val="373737"/>
                 <w:sz w:val="18"/>
               </w:rPr>
-              <w:t>33</w:t>
+              <w:t>13</w:t>
             </w:r>
           </w:p>
         </w:tc>
@@ -5619,7 +5710,7 @@
                 <w:color w:val="373737"/>
                 <w:sz w:val="18"/>
               </w:rPr>
-              <w:t>FederatedGqlBrakDown-product</w:t>
+              <w:t>FederatedGqlBrakDown-measurement</w:t>
             </w:r>
           </w:p>
         </w:tc>
@@ -5657,7 +5748,7 @@
                 <w:color w:val="373737"/>
                 <w:sz w:val="18"/>
               </w:rPr>
-              <w:t>Product Details</w:t>
+              <w:t>Packaging</w:t>
             </w:r>
           </w:p>
         </w:tc>
@@ -5693,7 +5784,7 @@
                 <w:color w:val="373737"/>
                 <w:sz w:val="18"/>
               </w:rPr>
-              <w:t>M</w:t>
+              <w:t>L</w:t>
             </w:r>
           </w:p>
         </w:tc>
@@ -5711,6 +5802,78 @@
                 <w:color w:val="373737"/>
                 <w:sz w:val="18"/>
               </w:rPr>
+              <w:t>24</w:t>
+            </w:r>
+          </w:p>
+        </w:tc>
+        <w:tc>
+          <w:tcPr>
+            <w:vAlign w:val="top"/>
+            <w:tcW w:w="648" w:type="dxa"/>
+          </w:tcPr>
+          <w:p>
+            <w:pPr>
+              <w:jc w:val="left"/>
+            </w:pPr>
+            <w:r>
+              <w:rPr>
+                <w:color w:val="373737"/>
+                <w:sz w:val="18"/>
+              </w:rPr>
+              <w:t>0</w:t>
+            </w:r>
+          </w:p>
+        </w:tc>
+        <w:tc>
+          <w:tcPr>
+            <w:vAlign w:val="top"/>
+            <w:tcW w:w="648" w:type="dxa"/>
+          </w:tcPr>
+          <w:p>
+            <w:pPr>
+              <w:jc w:val="left"/>
+            </w:pPr>
+            <w:r>
+              <w:rPr>
+                <w:color w:val="373737"/>
+                <w:sz w:val="18"/>
+              </w:rPr>
+              <w:t>2</w:t>
+            </w:r>
+          </w:p>
+        </w:tc>
+        <w:tc>
+          <w:tcPr>
+            <w:vAlign w:val="top"/>
+            <w:tcW w:w="648" w:type="dxa"/>
+          </w:tcPr>
+          <w:p>
+            <w:pPr>
+              <w:jc w:val="left"/>
+            </w:pPr>
+            <w:r>
+              <w:rPr>
+                <w:color w:val="373737"/>
+                <w:sz w:val="18"/>
+              </w:rPr>
+              <w:t>9</w:t>
+            </w:r>
+          </w:p>
+        </w:tc>
+        <w:tc>
+          <w:tcPr>
+            <w:vAlign w:val="top"/>
+            <w:tcW w:w="648" w:type="dxa"/>
+          </w:tcPr>
+          <w:p>
+            <w:pPr>
+              <w:jc w:val="left"/>
+            </w:pPr>
+            <w:r>
+              <w:rPr>
+                <w:color w:val="373737"/>
+                <w:sz w:val="18"/>
+              </w:rPr>
               <w:t>13</w:t>
             </w:r>
           </w:p>
@@ -5718,78 +5881,6 @@
         <w:tc>
           <w:tcPr>
             <w:vAlign w:val="top"/>
-            <w:tcW w:w="648" w:type="dxa"/>
-          </w:tcPr>
-          <w:p>
-            <w:pPr>
-              <w:jc w:val="left"/>
-            </w:pPr>
-            <w:r>
-              <w:rPr>
-                <w:color w:val="373737"/>
-                <w:sz w:val="18"/>
-              </w:rPr>
-              <w:t>0</w:t>
-            </w:r>
-          </w:p>
-        </w:tc>
-        <w:tc>
-          <w:tcPr>
-            <w:vAlign w:val="top"/>
-            <w:tcW w:w="648" w:type="dxa"/>
-          </w:tcPr>
-          <w:p>
-            <w:pPr>
-              <w:jc w:val="left"/>
-            </w:pPr>
-            <w:r>
-              <w:rPr>
-                <w:color w:val="373737"/>
-                <w:sz w:val="18"/>
-              </w:rPr>
-              <w:t>1</w:t>
-            </w:r>
-          </w:p>
-        </w:tc>
-        <w:tc>
-          <w:tcPr>
-            <w:vAlign w:val="top"/>
-            <w:tcW w:w="648" w:type="dxa"/>
-          </w:tcPr>
-          <w:p>
-            <w:pPr>
-              <w:jc w:val="left"/>
-            </w:pPr>
-            <w:r>
-              <w:rPr>
-                <w:color w:val="373737"/>
-                <w:sz w:val="18"/>
-              </w:rPr>
-              <w:t>7</w:t>
-            </w:r>
-          </w:p>
-        </w:tc>
-        <w:tc>
-          <w:tcPr>
-            <w:vAlign w:val="top"/>
-            <w:tcW w:w="648" w:type="dxa"/>
-          </w:tcPr>
-          <w:p>
-            <w:pPr>
-              <w:jc w:val="left"/>
-            </w:pPr>
-            <w:r>
-              <w:rPr>
-                <w:color w:val="373737"/>
-                <w:sz w:val="18"/>
-              </w:rPr>
-              <w:t>5</w:t>
-            </w:r>
-          </w:p>
-        </w:tc>
-        <w:tc>
-          <w:tcPr>
-            <w:vAlign w:val="top"/>
             <w:tcW w:w="2592" w:type="dxa"/>
           </w:tcPr>
           <w:p>
@@ -5801,7 +5892,7 @@
                 <w:color w:val="373737"/>
                 <w:sz w:val="18"/>
               </w:rPr>
-              <w:t>FederatedGqlBrakDown-productDetails</w:t>
+              <w:t>FederatedGqlBrakDown-packaging</w:t>
             </w:r>
           </w:p>
         </w:tc>
@@ -5841,7 +5932,7 @@
                 <w:color w:val="373737"/>
                 <w:sz w:val="18"/>
               </w:rPr>
-              <w:t>Watchlist</w:t>
+              <w:t>Product</w:t>
             </w:r>
           </w:p>
         </w:tc>
@@ -5860,7 +5951,7 @@
                 <w:color w:val="373737"/>
                 <w:sz w:val="18"/>
               </w:rPr>
-              <w:t>plm-product (co-located)</w:t>
+              <w:t>plm-product (host)</w:t>
             </w:r>
           </w:p>
         </w:tc>
@@ -5879,7 +5970,7 @@
                 <w:color w:val="373737"/>
                 <w:sz w:val="18"/>
               </w:rPr>
-              <w:t>M</w:t>
+              <w:t>XXL</w:t>
             </w:r>
           </w:p>
         </w:tc>
@@ -5898,7 +5989,7 @@
                 <w:color w:val="373737"/>
                 <w:sz w:val="18"/>
               </w:rPr>
-              <w:t>13</w:t>
+              <w:t>67</w:t>
             </w:r>
           </w:p>
         </w:tc>
@@ -5917,7 +6008,7 @@
                 <w:color w:val="373737"/>
                 <w:sz w:val="18"/>
               </w:rPr>
-              <w:t>0</w:t>
+              <w:t>5</w:t>
             </w:r>
           </w:p>
         </w:tc>
@@ -5936,7 +6027,7 @@
                 <w:color w:val="373737"/>
                 <w:sz w:val="18"/>
               </w:rPr>
-              <w:t>1</w:t>
+              <w:t>4</w:t>
             </w:r>
           </w:p>
         </w:tc>
@@ -5955,7 +6046,7 @@
                 <w:color w:val="373737"/>
                 <w:sz w:val="18"/>
               </w:rPr>
-              <w:t>6</w:t>
+              <w:t>25</w:t>
             </w:r>
           </w:p>
         </w:tc>
@@ -5974,7 +6065,7 @@
                 <w:color w:val="373737"/>
                 <w:sz w:val="18"/>
               </w:rPr>
-              <w:t>6</w:t>
+              <w:t>33</w:t>
             </w:r>
           </w:p>
         </w:tc>
@@ -5993,7 +6084,7 @@
                 <w:color w:val="373737"/>
                 <w:sz w:val="18"/>
               </w:rPr>
-              <w:t>FederatedGqlBrakDown-watchlist</w:t>
+              <w:t>FederatedGqlBrakDown-product</w:t>
             </w:r>
           </w:p>
         </w:tc>
@@ -6013,12 +6104,944 @@
                 <w:color w:val="373737"/>
                 <w:sz w:val="18"/>
               </w:rPr>
+              <w:t>9</w:t>
+            </w:r>
+          </w:p>
+        </w:tc>
+        <w:tc>
+          <w:tcPr>
+            <w:vAlign w:val="top"/>
+            <w:tcW w:w="1872" w:type="dxa"/>
+          </w:tcPr>
+          <w:p>
+            <w:pPr>
+              <w:jc w:val="left"/>
+            </w:pPr>
+            <w:r>
+              <w:rPr>
+                <w:color w:val="373737"/>
+                <w:sz w:val="18"/>
+              </w:rPr>
+              <w:t>Product Details</w:t>
+            </w:r>
+          </w:p>
+        </w:tc>
+        <w:tc>
+          <w:tcPr>
+            <w:vAlign w:val="top"/>
+            <w:tcW w:w="2448" w:type="dxa"/>
+          </w:tcPr>
+          <w:p>
+            <w:pPr>
+              <w:jc w:val="left"/>
+            </w:pPr>
+            <w:r>
+              <w:rPr>
+                <w:color w:val="373737"/>
+                <w:sz w:val="18"/>
+              </w:rPr>
+              <w:t>plm-product (co-located)</w:t>
+            </w:r>
+          </w:p>
+        </w:tc>
+        <w:tc>
+          <w:tcPr>
+            <w:vAlign w:val="top"/>
+            <w:tcW w:w="864" w:type="dxa"/>
+          </w:tcPr>
+          <w:p>
+            <w:pPr>
+              <w:jc w:val="left"/>
+            </w:pPr>
+            <w:r>
+              <w:rPr>
+                <w:color w:val="373737"/>
+                <w:sz w:val="18"/>
+              </w:rPr>
+              <w:t>M</w:t>
+            </w:r>
+          </w:p>
+        </w:tc>
+        <w:tc>
+          <w:tcPr>
+            <w:vAlign w:val="top"/>
+            <w:tcW w:w="864" w:type="dxa"/>
+          </w:tcPr>
+          <w:p>
+            <w:pPr>
+              <w:jc w:val="left"/>
+            </w:pPr>
+            <w:r>
+              <w:rPr>
+                <w:color w:val="373737"/>
+                <w:sz w:val="18"/>
+              </w:rPr>
+              <w:t>13</w:t>
+            </w:r>
+          </w:p>
+        </w:tc>
+        <w:tc>
+          <w:tcPr>
+            <w:vAlign w:val="top"/>
+            <w:tcW w:w="648" w:type="dxa"/>
+          </w:tcPr>
+          <w:p>
+            <w:pPr>
+              <w:jc w:val="left"/>
+            </w:pPr>
+            <w:r>
+              <w:rPr>
+                <w:color w:val="373737"/>
+                <w:sz w:val="18"/>
+              </w:rPr>
+              <w:t>0</w:t>
+            </w:r>
+          </w:p>
+        </w:tc>
+        <w:tc>
+          <w:tcPr>
+            <w:vAlign w:val="top"/>
+            <w:tcW w:w="648" w:type="dxa"/>
+          </w:tcPr>
+          <w:p>
+            <w:pPr>
+              <w:jc w:val="left"/>
+            </w:pPr>
+            <w:r>
+              <w:rPr>
+                <w:color w:val="373737"/>
+                <w:sz w:val="18"/>
+              </w:rPr>
+              <w:t>1</w:t>
+            </w:r>
+          </w:p>
+        </w:tc>
+        <w:tc>
+          <w:tcPr>
+            <w:vAlign w:val="top"/>
+            <w:tcW w:w="648" w:type="dxa"/>
+          </w:tcPr>
+          <w:p>
+            <w:pPr>
+              <w:jc w:val="left"/>
+            </w:pPr>
+            <w:r>
+              <w:rPr>
+                <w:color w:val="373737"/>
+                <w:sz w:val="18"/>
+              </w:rPr>
+              <w:t>7</w:t>
+            </w:r>
+          </w:p>
+        </w:tc>
+        <w:tc>
+          <w:tcPr>
+            <w:vAlign w:val="top"/>
+            <w:tcW w:w="648" w:type="dxa"/>
+          </w:tcPr>
+          <w:p>
+            <w:pPr>
+              <w:jc w:val="left"/>
+            </w:pPr>
+            <w:r>
+              <w:rPr>
+                <w:color w:val="373737"/>
+                <w:sz w:val="18"/>
+              </w:rPr>
+              <w:t>5</w:t>
+            </w:r>
+          </w:p>
+        </w:tc>
+        <w:tc>
+          <w:tcPr>
+            <w:vAlign w:val="top"/>
+            <w:tcW w:w="2592" w:type="dxa"/>
+          </w:tcPr>
+          <w:p>
+            <w:pPr>
+              <w:jc w:val="left"/>
+            </w:pPr>
+            <w:r>
+              <w:rPr>
+                <w:color w:val="373737"/>
+                <w:sz w:val="18"/>
+              </w:rPr>
+              <w:t>FederatedGqlBrakDown-productDetails</w:t>
+            </w:r>
+          </w:p>
+        </w:tc>
+      </w:tr>
+      <w:tr>
+        <w:tc>
+          <w:tcPr>
+            <w:shd w:val="clear" w:color="auto" w:fill="F5F8FF"/>
+            <w:vAlign w:val="top"/>
+            <w:tcW w:w="432" w:type="dxa"/>
+          </w:tcPr>
+          <w:p>
+            <w:pPr>
+              <w:jc w:val="left"/>
+            </w:pPr>
+            <w:r>
+              <w:rPr>
+                <w:color w:val="373737"/>
+                <w:sz w:val="18"/>
+              </w:rPr>
+              <w:t>10</w:t>
+            </w:r>
+          </w:p>
+        </w:tc>
+        <w:tc>
+          <w:tcPr>
+            <w:shd w:val="clear" w:color="auto" w:fill="F5F8FF"/>
+            <w:vAlign w:val="top"/>
+            <w:tcW w:w="1872" w:type="dxa"/>
+          </w:tcPr>
+          <w:p>
+            <w:pPr>
+              <w:jc w:val="left"/>
+            </w:pPr>
+            <w:r>
+              <w:rPr>
+                <w:color w:val="373737"/>
+                <w:sz w:val="18"/>
+              </w:rPr>
+              <w:t>Sample</w:t>
+            </w:r>
+          </w:p>
+        </w:tc>
+        <w:tc>
+          <w:tcPr>
+            <w:shd w:val="clear" w:color="auto" w:fill="F5F8FF"/>
+            <w:vAlign w:val="top"/>
+            <w:tcW w:w="2448" w:type="dxa"/>
+          </w:tcPr>
+          <w:p>
+            <w:pPr>
+              <w:jc w:val="left"/>
+            </w:pPr>
+            <w:r>
+              <w:rPr>
+                <w:color w:val="373737"/>
+                <w:sz w:val="18"/>
+              </w:rPr>
+              <w:t>plm-sample (separate)</w:t>
+            </w:r>
+          </w:p>
+        </w:tc>
+        <w:tc>
+          <w:tcPr>
+            <w:shd w:val="clear" w:color="auto" w:fill="F5F8FF"/>
+            <w:vAlign w:val="top"/>
+            <w:tcW w:w="864" w:type="dxa"/>
+          </w:tcPr>
+          <w:p>
+            <w:pPr>
+              <w:jc w:val="left"/>
+            </w:pPr>
+            <w:r>
+              <w:rPr>
+                <w:color w:val="373737"/>
+                <w:sz w:val="18"/>
+              </w:rPr>
+              <w:t>XL</w:t>
+            </w:r>
+          </w:p>
+        </w:tc>
+        <w:tc>
+          <w:tcPr>
+            <w:shd w:val="clear" w:color="auto" w:fill="F5F8FF"/>
+            <w:vAlign w:val="top"/>
+            <w:tcW w:w="864" w:type="dxa"/>
+          </w:tcPr>
+          <w:p>
+            <w:pPr>
+              <w:jc w:val="left"/>
+            </w:pPr>
+            <w:r>
+              <w:rPr>
+                <w:color w:val="373737"/>
+                <w:sz w:val="18"/>
+              </w:rPr>
+              <w:t>28</w:t>
+            </w:r>
+          </w:p>
+        </w:tc>
+        <w:tc>
+          <w:tcPr>
+            <w:shd w:val="clear" w:color="auto" w:fill="F5F8FF"/>
+            <w:vAlign w:val="top"/>
+            <w:tcW w:w="648" w:type="dxa"/>
+          </w:tcPr>
+          <w:p>
+            <w:pPr>
+              <w:jc w:val="left"/>
+            </w:pPr>
+            <w:r>
+              <w:rPr>
+                <w:color w:val="373737"/>
+                <w:sz w:val="18"/>
+              </w:rPr>
+              <w:t>0</w:t>
+            </w:r>
+          </w:p>
+        </w:tc>
+        <w:tc>
+          <w:tcPr>
+            <w:shd w:val="clear" w:color="auto" w:fill="F5F8FF"/>
+            <w:vAlign w:val="top"/>
+            <w:tcW w:w="648" w:type="dxa"/>
+          </w:tcPr>
+          <w:p>
+            <w:pPr>
+              <w:jc w:val="left"/>
+            </w:pPr>
+            <w:r>
+              <w:rPr>
+                <w:color w:val="373737"/>
+                <w:sz w:val="18"/>
+              </w:rPr>
+              <w:t>5</w:t>
+            </w:r>
+          </w:p>
+        </w:tc>
+        <w:tc>
+          <w:tcPr>
+            <w:shd w:val="clear" w:color="auto" w:fill="F5F8FF"/>
+            <w:vAlign w:val="top"/>
+            <w:tcW w:w="648" w:type="dxa"/>
+          </w:tcPr>
+          <w:p>
+            <w:pPr>
+              <w:jc w:val="left"/>
+            </w:pPr>
+            <w:r>
+              <w:rPr>
+                <w:color w:val="373737"/>
+                <w:sz w:val="18"/>
+              </w:rPr>
+              <w:t>11</w:t>
+            </w:r>
+          </w:p>
+        </w:tc>
+        <w:tc>
+          <w:tcPr>
+            <w:shd w:val="clear" w:color="auto" w:fill="F5F8FF"/>
+            <w:vAlign w:val="top"/>
+            <w:tcW w:w="648" w:type="dxa"/>
+          </w:tcPr>
+          <w:p>
+            <w:pPr>
+              <w:jc w:val="left"/>
+            </w:pPr>
+            <w:r>
+              <w:rPr>
+                <w:color w:val="373737"/>
+                <w:sz w:val="18"/>
+              </w:rPr>
+              <w:t>12</w:t>
+            </w:r>
+          </w:p>
+        </w:tc>
+        <w:tc>
+          <w:tcPr>
+            <w:shd w:val="clear" w:color="auto" w:fill="F5F8FF"/>
+            <w:vAlign w:val="top"/>
+            <w:tcW w:w="2592" w:type="dxa"/>
+          </w:tcPr>
+          <w:p>
+            <w:pPr>
+              <w:jc w:val="left"/>
+            </w:pPr>
+            <w:r>
+              <w:rPr>
+                <w:color w:val="373737"/>
+                <w:sz w:val="18"/>
+              </w:rPr>
+              <w:t>FederatedGqlBrakDown-sample</w:t>
+            </w:r>
+          </w:p>
+        </w:tc>
+      </w:tr>
+      <w:tr>
+        <w:tc>
+          <w:tcPr>
+            <w:vAlign w:val="top"/>
+            <w:tcW w:w="432" w:type="dxa"/>
+          </w:tcPr>
+          <w:p>
+            <w:pPr>
+              <w:jc w:val="left"/>
+            </w:pPr>
+            <w:r>
+              <w:rPr>
+                <w:color w:val="373737"/>
+                <w:sz w:val="18"/>
+              </w:rPr>
+              <w:t>11</w:t>
+            </w:r>
+          </w:p>
+        </w:tc>
+        <w:tc>
+          <w:tcPr>
+            <w:vAlign w:val="top"/>
+            <w:tcW w:w="1872" w:type="dxa"/>
+          </w:tcPr>
+          <w:p>
+            <w:pPr>
+              <w:jc w:val="left"/>
+            </w:pPr>
+            <w:r>
+              <w:rPr>
+                <w:color w:val="373737"/>
+                <w:sz w:val="18"/>
+              </w:rPr>
+              <w:t>Search</w:t>
+            </w:r>
+          </w:p>
+        </w:tc>
+        <w:tc>
+          <w:tcPr>
+            <w:vAlign w:val="top"/>
+            <w:tcW w:w="2448" w:type="dxa"/>
+          </w:tcPr>
+          <w:p>
+            <w:pPr>
+              <w:jc w:val="left"/>
+            </w:pPr>
+            <w:r>
+              <w:rPr>
+                <w:color w:val="373737"/>
+                <w:sz w:val="18"/>
+              </w:rPr>
+              <w:t>plm-elastic-search (separate)</w:t>
+            </w:r>
+          </w:p>
+        </w:tc>
+        <w:tc>
+          <w:tcPr>
+            <w:vAlign w:val="top"/>
+            <w:tcW w:w="864" w:type="dxa"/>
+          </w:tcPr>
+          <w:p>
+            <w:pPr>
+              <w:jc w:val="left"/>
+            </w:pPr>
+            <w:r>
+              <w:rPr>
+                <w:color w:val="373737"/>
+                <w:sz w:val="18"/>
+              </w:rPr>
+              <w:t>L</w:t>
+            </w:r>
+          </w:p>
+        </w:tc>
+        <w:tc>
+          <w:tcPr>
+            <w:vAlign w:val="top"/>
+            <w:tcW w:w="864" w:type="dxa"/>
+          </w:tcPr>
+          <w:p>
+            <w:pPr>
+              <w:jc w:val="left"/>
+            </w:pPr>
+            <w:r>
+              <w:rPr>
+                <w:color w:val="373737"/>
+                <w:sz w:val="18"/>
+              </w:rPr>
+              <w:t>25</w:t>
+            </w:r>
+          </w:p>
+        </w:tc>
+        <w:tc>
+          <w:tcPr>
+            <w:vAlign w:val="top"/>
+            <w:tcW w:w="648" w:type="dxa"/>
+          </w:tcPr>
+          <w:p>
+            <w:pPr>
+              <w:jc w:val="left"/>
+            </w:pPr>
+            <w:r>
+              <w:rPr>
+                <w:color w:val="373737"/>
+                <w:sz w:val="18"/>
+              </w:rPr>
+              <w:t>0</w:t>
+            </w:r>
+          </w:p>
+        </w:tc>
+        <w:tc>
+          <w:tcPr>
+            <w:vAlign w:val="top"/>
+            <w:tcW w:w="648" w:type="dxa"/>
+          </w:tcPr>
+          <w:p>
+            <w:pPr>
+              <w:jc w:val="left"/>
+            </w:pPr>
+            <w:r>
+              <w:rPr>
+                <w:color w:val="373737"/>
+                <w:sz w:val="18"/>
+              </w:rPr>
+              <w:t>7</w:t>
+            </w:r>
+          </w:p>
+        </w:tc>
+        <w:tc>
+          <w:tcPr>
+            <w:vAlign w:val="top"/>
+            <w:tcW w:w="648" w:type="dxa"/>
+          </w:tcPr>
+          <w:p>
+            <w:pPr>
+              <w:jc w:val="left"/>
+            </w:pPr>
+            <w:r>
+              <w:rPr>
+                <w:color w:val="373737"/>
+                <w:sz w:val="18"/>
+              </w:rPr>
+              <w:t>11</w:t>
+            </w:r>
+          </w:p>
+        </w:tc>
+        <w:tc>
+          <w:tcPr>
+            <w:vAlign w:val="top"/>
+            <w:tcW w:w="648" w:type="dxa"/>
+          </w:tcPr>
+          <w:p>
+            <w:pPr>
+              <w:jc w:val="left"/>
+            </w:pPr>
+            <w:r>
+              <w:rPr>
+                <w:color w:val="373737"/>
+                <w:sz w:val="18"/>
+              </w:rPr>
+              <w:t>7</w:t>
+            </w:r>
+          </w:p>
+        </w:tc>
+        <w:tc>
+          <w:tcPr>
+            <w:vAlign w:val="top"/>
+            <w:tcW w:w="2592" w:type="dxa"/>
+          </w:tcPr>
+          <w:p>
+            <w:pPr>
+              <w:jc w:val="left"/>
+            </w:pPr>
+            <w:r>
+              <w:rPr>
+                <w:color w:val="373737"/>
+                <w:sz w:val="18"/>
+              </w:rPr>
+              <w:t>FederatedGqlBrakDown-search</w:t>
+            </w:r>
+          </w:p>
+        </w:tc>
+      </w:tr>
+      <w:tr>
+        <w:tc>
+          <w:tcPr>
+            <w:shd w:val="clear" w:color="auto" w:fill="F5F8FF"/>
+            <w:vAlign w:val="top"/>
+            <w:tcW w:w="432" w:type="dxa"/>
+          </w:tcPr>
+          <w:p>
+            <w:pPr>
+              <w:jc w:val="left"/>
+            </w:pPr>
+            <w:r>
+              <w:rPr>
+                <w:color w:val="373737"/>
+                <w:sz w:val="18"/>
+              </w:rPr>
+              <w:t>12</w:t>
+            </w:r>
+          </w:p>
+        </w:tc>
+        <w:tc>
+          <w:tcPr>
+            <w:shd w:val="clear" w:color="auto" w:fill="F5F8FF"/>
+            <w:vAlign w:val="top"/>
+            <w:tcW w:w="1872" w:type="dxa"/>
+          </w:tcPr>
+          <w:p>
+            <w:pPr>
+              <w:jc w:val="left"/>
+            </w:pPr>
+            <w:r>
+              <w:rPr>
+                <w:color w:val="373737"/>
+                <w:sz w:val="18"/>
+              </w:rPr>
+              <w:t>Watchlist</w:t>
+            </w:r>
+          </w:p>
+        </w:tc>
+        <w:tc>
+          <w:tcPr>
+            <w:shd w:val="clear" w:color="auto" w:fill="F5F8FF"/>
+            <w:vAlign w:val="top"/>
+            <w:tcW w:w="2448" w:type="dxa"/>
+          </w:tcPr>
+          <w:p>
+            <w:pPr>
+              <w:jc w:val="left"/>
+            </w:pPr>
+            <w:r>
+              <w:rPr>
+                <w:color w:val="373737"/>
+                <w:sz w:val="18"/>
+              </w:rPr>
+              <w:t>plm-product (co-located)</w:t>
+            </w:r>
+          </w:p>
+        </w:tc>
+        <w:tc>
+          <w:tcPr>
+            <w:shd w:val="clear" w:color="auto" w:fill="F5F8FF"/>
+            <w:vAlign w:val="top"/>
+            <w:tcW w:w="864" w:type="dxa"/>
+          </w:tcPr>
+          <w:p>
+            <w:pPr>
+              <w:jc w:val="left"/>
+            </w:pPr>
+            <w:r>
+              <w:rPr>
+                <w:color w:val="373737"/>
+                <w:sz w:val="18"/>
+              </w:rPr>
+              <w:t>M</w:t>
+            </w:r>
+          </w:p>
+        </w:tc>
+        <w:tc>
+          <w:tcPr>
+            <w:shd w:val="clear" w:color="auto" w:fill="F5F8FF"/>
+            <w:vAlign w:val="top"/>
+            <w:tcW w:w="864" w:type="dxa"/>
+          </w:tcPr>
+          <w:p>
+            <w:pPr>
+              <w:jc w:val="left"/>
+            </w:pPr>
+            <w:r>
+              <w:rPr>
+                <w:color w:val="373737"/>
+                <w:sz w:val="18"/>
+              </w:rPr>
+              <w:t>13</w:t>
+            </w:r>
+          </w:p>
+        </w:tc>
+        <w:tc>
+          <w:tcPr>
+            <w:shd w:val="clear" w:color="auto" w:fill="F5F8FF"/>
+            <w:vAlign w:val="top"/>
+            <w:tcW w:w="648" w:type="dxa"/>
+          </w:tcPr>
+          <w:p>
+            <w:pPr>
+              <w:jc w:val="left"/>
+            </w:pPr>
+            <w:r>
+              <w:rPr>
+                <w:color w:val="373737"/>
+                <w:sz w:val="18"/>
+              </w:rPr>
+              <w:t>0</w:t>
+            </w:r>
+          </w:p>
+        </w:tc>
+        <w:tc>
+          <w:tcPr>
+            <w:shd w:val="clear" w:color="auto" w:fill="F5F8FF"/>
+            <w:vAlign w:val="top"/>
+            <w:tcW w:w="648" w:type="dxa"/>
+          </w:tcPr>
+          <w:p>
+            <w:pPr>
+              <w:jc w:val="left"/>
+            </w:pPr>
+            <w:r>
+              <w:rPr>
+                <w:color w:val="373737"/>
+                <w:sz w:val="18"/>
+              </w:rPr>
+              <w:t>1</w:t>
+            </w:r>
+          </w:p>
+        </w:tc>
+        <w:tc>
+          <w:tcPr>
+            <w:shd w:val="clear" w:color="auto" w:fill="F5F8FF"/>
+            <w:vAlign w:val="top"/>
+            <w:tcW w:w="648" w:type="dxa"/>
+          </w:tcPr>
+          <w:p>
+            <w:pPr>
+              <w:jc w:val="left"/>
+            </w:pPr>
+            <w:r>
+              <w:rPr>
+                <w:color w:val="373737"/>
+                <w:sz w:val="18"/>
+              </w:rPr>
+              <w:t>6</w:t>
+            </w:r>
+          </w:p>
+        </w:tc>
+        <w:tc>
+          <w:tcPr>
+            <w:shd w:val="clear" w:color="auto" w:fill="F5F8FF"/>
+            <w:vAlign w:val="top"/>
+            <w:tcW w:w="648" w:type="dxa"/>
+          </w:tcPr>
+          <w:p>
+            <w:pPr>
+              <w:jc w:val="left"/>
+            </w:pPr>
+            <w:r>
+              <w:rPr>
+                <w:color w:val="373737"/>
+                <w:sz w:val="18"/>
+              </w:rPr>
+              <w:t>6</w:t>
+            </w:r>
+          </w:p>
+        </w:tc>
+        <w:tc>
+          <w:tcPr>
+            <w:shd w:val="clear" w:color="auto" w:fill="F5F8FF"/>
+            <w:vAlign w:val="top"/>
+            <w:tcW w:w="2592" w:type="dxa"/>
+          </w:tcPr>
+          <w:p>
+            <w:pPr>
+              <w:jc w:val="left"/>
+            </w:pPr>
+            <w:r>
+              <w:rPr>
+                <w:color w:val="373737"/>
+                <w:sz w:val="18"/>
+              </w:rPr>
+              <w:t>FederatedGqlBrakDown-watchlist</w:t>
+            </w:r>
+          </w:p>
+        </w:tc>
+      </w:tr>
+      <w:tr>
+        <w:tc>
+          <w:tcPr>
+            <w:vAlign w:val="top"/>
+            <w:tcW w:w="432" w:type="dxa"/>
+          </w:tcPr>
+          <w:p>
+            <w:pPr>
+              <w:jc w:val="left"/>
+            </w:pPr>
+            <w:r>
+              <w:rPr>
+                <w:color w:val="373737"/>
+                <w:sz w:val="18"/>
+              </w:rPr>
+              <w:t>13</w:t>
+            </w:r>
+          </w:p>
+        </w:tc>
+        <w:tc>
+          <w:tcPr>
+            <w:vAlign w:val="top"/>
+            <w:tcW w:w="1872" w:type="dxa"/>
+          </w:tcPr>
+          <w:p>
+            <w:pPr>
+              <w:jc w:val="left"/>
+            </w:pPr>
+            <w:r>
+              <w:rPr>
+                <w:color w:val="373737"/>
+                <w:sz w:val="18"/>
+              </w:rPr>
+              <w:t>Workspace</w:t>
+            </w:r>
+          </w:p>
+        </w:tc>
+        <w:tc>
+          <w:tcPr>
+            <w:vAlign w:val="top"/>
+            <w:tcW w:w="2448" w:type="dxa"/>
+          </w:tcPr>
+          <w:p>
+            <w:pPr>
+              <w:jc w:val="left"/>
+            </w:pPr>
+            <w:r>
+              <w:rPr>
+                <w:color w:val="373737"/>
+                <w:sz w:val="18"/>
+              </w:rPr>
+              <w:t>plm-workspace (separate)</w:t>
+            </w:r>
+          </w:p>
+        </w:tc>
+        <w:tc>
+          <w:tcPr>
+            <w:vAlign w:val="top"/>
+            <w:tcW w:w="864" w:type="dxa"/>
+          </w:tcPr>
+          <w:p>
+            <w:pPr>
+              <w:jc w:val="left"/>
+            </w:pPr>
+            <w:r>
+              <w:rPr>
+                <w:color w:val="373737"/>
+                <w:sz w:val="18"/>
+              </w:rPr>
+              <w:t>XL</w:t>
+            </w:r>
+          </w:p>
+        </w:tc>
+        <w:tc>
+          <w:tcPr>
+            <w:vAlign w:val="top"/>
+            <w:tcW w:w="864" w:type="dxa"/>
+          </w:tcPr>
+          <w:p>
+            <w:pPr>
+              <w:jc w:val="left"/>
+            </w:pPr>
+            <w:r>
+              <w:rPr>
+                <w:color w:val="373737"/>
+                <w:sz w:val="18"/>
+              </w:rPr>
+              <w:t>28</w:t>
+            </w:r>
+          </w:p>
+        </w:tc>
+        <w:tc>
+          <w:tcPr>
+            <w:vAlign w:val="top"/>
+            <w:tcW w:w="648" w:type="dxa"/>
+          </w:tcPr>
+          <w:p>
+            <w:pPr>
+              <w:jc w:val="left"/>
+            </w:pPr>
+            <w:r>
+              <w:rPr>
+                <w:color w:val="373737"/>
+                <w:sz w:val="18"/>
+              </w:rPr>
+              <w:t>3</w:t>
+            </w:r>
+          </w:p>
+        </w:tc>
+        <w:tc>
+          <w:tcPr>
+            <w:vAlign w:val="top"/>
+            <w:tcW w:w="648" w:type="dxa"/>
+          </w:tcPr>
+          <w:p>
+            <w:pPr>
+              <w:jc w:val="left"/>
+            </w:pPr>
+            <w:r>
+              <w:rPr>
+                <w:color w:val="373737"/>
+                <w:sz w:val="18"/>
+              </w:rPr>
+              <w:t>3</w:t>
+            </w:r>
+          </w:p>
+        </w:tc>
+        <w:tc>
+          <w:tcPr>
+            <w:vAlign w:val="top"/>
+            <w:tcW w:w="648" w:type="dxa"/>
+          </w:tcPr>
+          <w:p>
+            <w:pPr>
+              <w:jc w:val="left"/>
+            </w:pPr>
+            <w:r>
+              <w:rPr>
+                <w:color w:val="373737"/>
+                <w:sz w:val="18"/>
+              </w:rPr>
+              <w:t>13</w:t>
+            </w:r>
+          </w:p>
+        </w:tc>
+        <w:tc>
+          <w:tcPr>
+            <w:vAlign w:val="top"/>
+            <w:tcW w:w="648" w:type="dxa"/>
+          </w:tcPr>
+          <w:p>
+            <w:pPr>
+              <w:jc w:val="left"/>
+            </w:pPr>
+            <w:r>
+              <w:rPr>
+                <w:color w:val="373737"/>
+                <w:sz w:val="18"/>
+              </w:rPr>
+              <w:t>9</w:t>
+            </w:r>
+          </w:p>
+        </w:tc>
+        <w:tc>
+          <w:tcPr>
+            <w:vAlign w:val="top"/>
+            <w:tcW w:w="2592" w:type="dxa"/>
+          </w:tcPr>
+          <w:p>
+            <w:pPr>
+              <w:jc w:val="left"/>
+            </w:pPr>
+            <w:r>
+              <w:rPr>
+                <w:color w:val="373737"/>
+                <w:sz w:val="18"/>
+              </w:rPr>
+              <w:t>FederatedGqlBrakDown-workspace</w:t>
+            </w:r>
+          </w:p>
+        </w:tc>
+      </w:tr>
+      <w:tr>
+        <w:tc>
+          <w:tcPr>
+            <w:shd w:val="clear" w:color="auto" w:fill="F5F8FF"/>
+            <w:vAlign w:val="top"/>
+            <w:tcW w:w="432" w:type="dxa"/>
+          </w:tcPr>
+          <w:p>
+            <w:pPr>
+              <w:jc w:val="left"/>
+            </w:pPr>
+            <w:r>
+              <w:rPr>
+                <w:color w:val="373737"/>
+                <w:sz w:val="18"/>
+              </w:rPr>
               <w:t>—</w:t>
             </w:r>
           </w:p>
         </w:tc>
         <w:tc>
           <w:tcPr>
+            <w:shd w:val="clear" w:color="auto" w:fill="F5F8FF"/>
             <w:vAlign w:val="top"/>
             <w:tcW w:w="1872" w:type="dxa"/>
           </w:tcPr>
@@ -6037,6 +7060,7 @@
         </w:tc>
         <w:tc>
           <w:tcPr>
+            <w:shd w:val="clear" w:color="auto" w:fill="F5F8FF"/>
             <w:vAlign w:val="top"/>
             <w:tcW w:w="2448" w:type="dxa"/>
           </w:tcPr>
@@ -6055,6 +7079,7 @@
         </w:tc>
         <w:tc>
           <w:tcPr>
+            <w:shd w:val="clear" w:color="auto" w:fill="F5F8FF"/>
             <w:vAlign w:val="top"/>
             <w:tcW w:w="864" w:type="dxa"/>
           </w:tcPr>
@@ -6073,6 +7098,7 @@
         </w:tc>
         <w:tc>
           <w:tcPr>
+            <w:shd w:val="clear" w:color="auto" w:fill="F5F8FF"/>
             <w:vAlign w:val="top"/>
             <w:tcW w:w="864" w:type="dxa"/>
           </w:tcPr>
@@ -6085,12 +7111,13 @@
                 <w:color w:val="373737"/>
                 <w:sz w:val="18"/>
               </w:rPr>
-              <w:t>200</w:t>
-            </w:r>
-          </w:p>
-        </w:tc>
-        <w:tc>
-          <w:tcPr>
+              <w:t>337</w:t>
+            </w:r>
+          </w:p>
+        </w:tc>
+        <w:tc>
+          <w:tcPr>
+            <w:shd w:val="clear" w:color="auto" w:fill="F5F8FF"/>
             <w:vAlign w:val="top"/>
             <w:tcW w:w="648" w:type="dxa"/>
           </w:tcPr>
@@ -6103,12 +7130,13 @@
                 <w:color w:val="373737"/>
                 <w:sz w:val="18"/>
               </w:rPr>
-              <w:t>6</w:t>
-            </w:r>
-          </w:p>
-        </w:tc>
-        <w:tc>
-          <w:tcPr>
+              <w:t>9</w:t>
+            </w:r>
+          </w:p>
+        </w:tc>
+        <w:tc>
+          <w:tcPr>
+            <w:shd w:val="clear" w:color="auto" w:fill="F5F8FF"/>
             <w:vAlign w:val="top"/>
             <w:tcW w:w="648" w:type="dxa"/>
           </w:tcPr>
@@ -6121,12 +7149,13 @@
                 <w:color w:val="373737"/>
                 <w:sz w:val="18"/>
               </w:rPr>
-              <w:t>13</w:t>
-            </w:r>
-          </w:p>
-        </w:tc>
-        <w:tc>
-          <w:tcPr>
+              <w:t>34</w:t>
+            </w:r>
+          </w:p>
+        </w:tc>
+        <w:tc>
+          <w:tcPr>
+            <w:shd w:val="clear" w:color="auto" w:fill="F5F8FF"/>
             <w:vAlign w:val="top"/>
             <w:tcW w:w="648" w:type="dxa"/>
           </w:tcPr>
@@ -6139,12 +7168,13 @@
                 <w:color w:val="373737"/>
                 <w:sz w:val="18"/>
               </w:rPr>
-              <w:t>76</w:t>
-            </w:r>
-          </w:p>
-        </w:tc>
-        <w:tc>
-          <w:tcPr>
+              <w:t>140</w:t>
+            </w:r>
+          </w:p>
+        </w:tc>
+        <w:tc>
+          <w:tcPr>
+            <w:shd w:val="clear" w:color="auto" w:fill="F5F8FF"/>
             <w:vAlign w:val="top"/>
             <w:tcW w:w="648" w:type="dxa"/>
           </w:tcPr>
@@ -6157,12 +7187,13 @@
                 <w:color w:val="373737"/>
                 <w:sz w:val="18"/>
               </w:rPr>
-              <w:t>105</w:t>
-            </w:r>
-          </w:p>
-        </w:tc>
-        <w:tc>
-          <w:tcPr>
+              <w:t>154</w:t>
+            </w:r>
+          </w:p>
+        </w:tc>
+        <w:tc>
+          <w:tcPr>
+            <w:shd w:val="clear" w:color="auto" w:fill="F5F8FF"/>
             <w:vAlign w:val="top"/>
             <w:tcW w:w="2592" w:type="dxa"/>
           </w:tcPr>
@@ -6906,28 +7937,42 @@
                 <w:rFonts w:ascii="Courier New" w:hAnsi="Courier New"/>
                 <w:sz w:val="18"/>
               </w:rPr>
-              <w:t>SPARK-MEAS-E01</w:t>
-            </w:r>
-            <w:r>
-              <w:rPr>
-                <w:color w:val="373737"/>
-                <w:sz w:val="18"/>
-              </w:rPr>
-              <w:t xml:space="preserve"> </w:t>
+              <w:t>SPARK-DISC-E01</w:t>
+            </w:r>
+            <w:r>
+              <w:rPr>
+                <w:color w:val="373737"/>
+                <w:sz w:val="18"/>
+              </w:rPr>
+              <w:t xml:space="preserve"> Participants V2 (</w:t>
             </w:r>
             <w:r>
               <w:rPr>
                 <w:rFonts w:ascii="Courier New" w:hAnsi="Courier New"/>
                 <w:sz w:val="18"/>
               </w:rPr>
-              <w:t>updateMeasurement</w:t>
-            </w:r>
-            <w:r>
-              <w:rPr>
-                <w:color w:val="373737"/>
-                <w:sz w:val="18"/>
-              </w:rPr>
-              <w:t xml:space="preserve"> — 2-step orchestrated write</w:t>
+              <w:t>updateParticipantsV2</w:t>
+            </w:r>
+            <w:r>
+              <w:rPr>
+                <w:color w:val="373737"/>
+                <w:sz w:val="18"/>
+              </w:rPr>
+              <w:t xml:space="preserve"> + </w:t>
+            </w:r>
+            <w:r>
+              <w:rPr>
+                <w:rFonts w:ascii="Courier New" w:hAnsi="Courier New"/>
+                <w:sz w:val="18"/>
+              </w:rPr>
+              <w:t>deleteParticipantV2</w:t>
+            </w:r>
+            <w:r>
+              <w:rPr>
+                <w:color w:val="373737"/>
+                <w:sz w:val="18"/>
+              </w:rPr>
+              <w:t>)</w:t>
             </w:r>
           </w:p>
         </w:tc>
@@ -6945,7 +7990,7 @@
                 <w:color w:val="373737"/>
                 <w:sz w:val="18"/>
               </w:rPr>
-              <w:t>measurement</w:t>
+              <w:t>discussion</w:t>
             </w:r>
           </w:p>
         </w:tc>
@@ -6981,7 +8026,7 @@
                 <w:rFonts w:ascii="Courier New" w:hAnsi="Courier New"/>
                 <w:sz w:val="18"/>
               </w:rPr>
-              <w:t>workspaceV2</w:t>
+              <w:t>userGroup</w:t>
             </w:r>
           </w:p>
         </w:tc>
@@ -6999,45 +8044,21 @@
                 <w:color w:val="373737"/>
                 <w:sz w:val="18"/>
               </w:rPr>
-              <w:t>workspaceAssociations = sparkMeasurement.updateWorkspaceAssociations \</w:t>
+              <w:t>add participants (AddParticipantInput) / remove a participant (team/user/partner)</w:t>
             </w:r>
           </w:p>
         </w:tc>
         <w:tc>
           <w:tcPr>
             <w:tcW w:type="dxa" w:w="1465"/>
-            <w:vAlign w:val="top"/>
-          </w:tcPr>
-          <w:p>
-            <w:pPr>
-              <w:jc w:val="left"/>
-            </w:pPr>
-            <w:r>
-              <w:rPr>
-                <w:color w:val="373737"/>
-                <w:sz w:val="18"/>
-              </w:rPr>
-              <w:t>\</w:t>
-            </w:r>
-          </w:p>
+          </w:tcPr>
+          <w:p/>
         </w:tc>
         <w:tc>
           <w:tcPr>
             <w:tcW w:type="dxa" w:w="1465"/>
-            <w:vAlign w:val="top"/>
-          </w:tcPr>
-          <w:p>
-            <w:pPr>
-              <w:jc w:val="left"/>
-            </w:pPr>
-            <w:r>
-              <w:rPr>
-                <w:color w:val="373737"/>
-                <w:sz w:val="18"/>
-              </w:rPr>
-              <w:t>{}. token for [humanId]. 2. If add/remove workspaces → workspaceAssociationHelper(MEASUREMENT…</w:t>
-            </w:r>
-          </w:p>
+          </w:tcPr>
+          <w:p/>
         </w:tc>
       </w:tr>
       <w:tr>
@@ -7063,28 +8084,70 @@
                 <w:rFonts w:ascii="Courier New" w:hAnsi="Courier New"/>
                 <w:sz w:val="18"/>
               </w:rPr>
-              <w:t>SPARK-PKG-E01</w:t>
-            </w:r>
-            <w:r>
-              <w:rPr>
-                <w:color w:val="373737"/>
-                <w:sz w:val="18"/>
-              </w:rPr>
-              <w:t xml:space="preserve"> </w:t>
+              <w:t>SPARK-DISC-E02</w:t>
+            </w:r>
+            <w:r>
+              <w:rPr>
+                <w:color w:val="373737"/>
+                <w:sz w:val="18"/>
+              </w:rPr>
+              <w:t xml:space="preserve"> Participants V3 (</w:t>
             </w:r>
             <w:r>
               <w:rPr>
                 <w:rFonts w:ascii="Courier New" w:hAnsi="Courier New"/>
                 <w:sz w:val="18"/>
               </w:rPr>
-              <w:t>updatePackaging</w:t>
-            </w:r>
-            <w:r>
-              <w:rPr>
-                <w:color w:val="373737"/>
-                <w:sz w:val="18"/>
-              </w:rPr>
-              <w:t xml:space="preserve"> (multi-step write)</w:t>
+              <w:t>updateParticipantsV3</w:t>
+            </w:r>
+            <w:r>
+              <w:rPr>
+                <w:color w:val="373737"/>
+                <w:sz w:val="18"/>
+              </w:rPr>
+              <w:t xml:space="preserve"> + </w:t>
+            </w:r>
+            <w:r>
+              <w:rPr>
+                <w:rFonts w:ascii="Courier New" w:hAnsi="Courier New"/>
+                <w:sz w:val="18"/>
+              </w:rPr>
+              <w:t>coreUpdate</w:t>
+            </w:r>
+            <w:r>
+              <w:rPr>
+                <w:color w:val="373737"/>
+                <w:sz w:val="18"/>
+              </w:rPr>
+              <w:t xml:space="preserve"> + </w:t>
+            </w:r>
+            <w:r>
+              <w:rPr>
+                <w:rFonts w:ascii="Courier New" w:hAnsi="Courier New"/>
+                <w:sz w:val="18"/>
+              </w:rPr>
+              <w:t>coreDelete</w:t>
+            </w:r>
+            <w:r>
+              <w:rPr>
+                <w:color w:val="373737"/>
+                <w:sz w:val="18"/>
+              </w:rPr>
+              <w:t xml:space="preserve"> + </w:t>
+            </w:r>
+            <w:r>
+              <w:rPr>
+                <w:rFonts w:ascii="Courier New" w:hAnsi="Courier New"/>
+                <w:sz w:val="18"/>
+              </w:rPr>
+              <w:t>deleteParticipantV3</w:t>
+            </w:r>
+            <w:r>
+              <w:rPr>
+                <w:color w:val="373737"/>
+                <w:sz w:val="18"/>
+              </w:rPr>
+              <w:t>)</w:t>
             </w:r>
           </w:p>
         </w:tc>
@@ -7103,7 +8166,7 @@
                 <w:color w:val="373737"/>
                 <w:sz w:val="18"/>
               </w:rPr>
-              <w:t>packaging</w:t>
+              <w:t>discussion</w:t>
             </w:r>
           </w:p>
         </w:tc>
@@ -7141,21 +8204,7 @@
                 <w:rFonts w:ascii="Courier New" w:hAnsi="Courier New"/>
                 <w:sz w:val="18"/>
               </w:rPr>
-              <w:t>attachment</w:t>
-            </w:r>
-            <w:r>
-              <w:rPr>
-                <w:color w:val="373737"/>
-                <w:sz w:val="18"/>
-              </w:rPr>
-              <w:t xml:space="preserve">, </w:t>
-            </w:r>
-            <w:r>
-              <w:rPr>
-                <w:rFonts w:ascii="Courier New" w:hAnsi="Courier New"/>
-                <w:sz w:val="18"/>
-              </w:rPr>
-              <w:t>relationship</w:t>
+              <w:t>userGroup</w:t>
             </w:r>
           </w:p>
         </w:tc>
@@ -7174,7 +8223,7 @@
                 <w:color w:val="373737"/>
                 <w:sz w:val="18"/>
               </w:rPr>
-              <w:t>token; set humanId=packagingId; PUT packaging/v1 (body); 2) if attachmentsToRemove → (attachment) archiveAttachmentBulkV2 + (relationship) removeRelationship; 3) if…</w:t>
+              <w:t>richer participant model — updateParticipantsV3 / coreUpdateParticipantsV3 - (participants + relatedResources + resourceType), coreDeleteParticipantsV3…</w:t>
             </w:r>
           </w:p>
         </w:tc>
@@ -7215,7 +8264,7 @@
                 <w:rFonts w:ascii="Courier New" w:hAnsi="Courier New"/>
                 <w:sz w:val="18"/>
               </w:rPr>
-              <w:t>SPARK-PROD-E02</w:t>
+              <w:t>SPARK-MEAS-E01</w:t>
             </w:r>
             <w:r>
               <w:rPr>
@@ -7229,14 +8278,14 @@
                 <w:rFonts w:ascii="Courier New" w:hAnsi="Courier New"/>
                 <w:sz w:val="18"/>
               </w:rPr>
-              <w:t>updateComponentStatuses</w:t>
-            </w:r>
-            <w:r>
-              <w:rPr>
-                <w:color w:val="373737"/>
-                <w:sz w:val="18"/>
-              </w:rPr>
-              <w:t xml:space="preserve"> (5-loader fan-out)</w:t>
+              <w:t>updateMeasurement</w:t>
+            </w:r>
+            <w:r>
+              <w:rPr>
+                <w:color w:val="373737"/>
+                <w:sz w:val="18"/>
+              </w:rPr>
+              <w:t xml:space="preserve"> — 2-step orchestrated write</w:t>
             </w:r>
           </w:p>
         </w:tc>
@@ -7254,7 +8303,7 @@
                 <w:color w:val="373737"/>
                 <w:sz w:val="18"/>
               </w:rPr>
-              <w:t>product</w:t>
+              <w:t>measurement</w:t>
             </w:r>
           </w:p>
         </w:tc>
@@ -7290,7 +8339,7 @@
                 <w:rFonts w:ascii="Courier New" w:hAnsi="Courier New"/>
                 <w:sz w:val="18"/>
               </w:rPr>
-              <w:t>claim</w:t>
+              <w:t>workspaceV2</w:t>
             </w:r>
           </w:p>
         </w:tc>
@@ -7308,21 +8357,45 @@
                 <w:color w:val="373737"/>
                 <w:sz w:val="18"/>
               </w:rPr>
-              <w:t>updating component statuses fans out to 5 places in parallel (bom, - measurement, productDetail, packaging — all internal — plus claim, external). - The bug: a loop…</w:t>
+              <w:t>workspaceAssociations = sparkMeasurement.updateWorkspaceAssociations \</w:t>
             </w:r>
           </w:p>
         </w:tc>
         <w:tc>
           <w:tcPr>
             <w:tcW w:type="dxa" w:w="1465"/>
-          </w:tcPr>
-          <w:p/>
+            <w:vAlign w:val="top"/>
+          </w:tcPr>
+          <w:p>
+            <w:pPr>
+              <w:jc w:val="left"/>
+            </w:pPr>
+            <w:r>
+              <w:rPr>
+                <w:color w:val="373737"/>
+                <w:sz w:val="18"/>
+              </w:rPr>
+              <w:t>\</w:t>
+            </w:r>
+          </w:p>
         </w:tc>
         <w:tc>
           <w:tcPr>
             <w:tcW w:type="dxa" w:w="1465"/>
-          </w:tcPr>
-          <w:p/>
+            <w:vAlign w:val="top"/>
+          </w:tcPr>
+          <w:p>
+            <w:pPr>
+              <w:jc w:val="left"/>
+            </w:pPr>
+            <w:r>
+              <w:rPr>
+                <w:color w:val="373737"/>
+                <w:sz w:val="18"/>
+              </w:rPr>
+              <w:t>{}. token for [humanId]. 2. If add/remove workspaces → workspaceAssociationHelper(MEASUREMENT…</w:t>
+            </w:r>
+          </w:p>
         </w:tc>
       </w:tr>
       <w:tr>
@@ -7348,7 +8421,7 @@
                 <w:rFonts w:ascii="Courier New" w:hAnsi="Courier New"/>
                 <w:sz w:val="18"/>
               </w:rPr>
-              <w:t>SPARK-PDTL-E01</w:t>
+              <w:t>SPARK-PKG-E01</w:t>
             </w:r>
             <w:r>
               <w:rPr>
@@ -7362,7 +8435,7 @@
                 <w:rFonts w:ascii="Courier New" w:hAnsi="Courier New"/>
                 <w:sz w:val="18"/>
               </w:rPr>
-              <w:t>updateProductDetailsSet</w:t>
+              <w:t>updatePackaging</w:t>
             </w:r>
             <w:r>
               <w:rPr>
@@ -7388,7 +8461,7 @@
                 <w:color w:val="373737"/>
                 <w:sz w:val="18"/>
               </w:rPr>
-              <w:t>productDetails</w:t>
+              <w:t>packaging</w:t>
             </w:r>
           </w:p>
         </w:tc>
@@ -7440,7 +8513,7 @@
                 <w:rFonts w:ascii="Courier New" w:hAnsi="Courier New"/>
                 <w:sz w:val="18"/>
               </w:rPr>
-              <w:t>workspaceV2</w:t>
+              <w:t>relationship</w:t>
             </w:r>
           </w:p>
         </w:tc>
@@ -7459,7 +8532,549 @@
                 <w:color w:val="373737"/>
                 <w:sz w:val="18"/>
               </w:rPr>
+              <w:t>token; set humanId=packagingId; PUT packaging/v1 (body); 2) if attachmentsToRemove → (attachment) archiveAttachmentBulkV2 + (relationship) removeRelationship; 3) if…</w:t>
+            </w:r>
+          </w:p>
+        </w:tc>
+        <w:tc>
+          <w:tcPr>
+            <w:tcW w:type="dxa" w:w="1465"/>
+            <w:shd w:val="clear" w:color="auto" w:fill="F5F8FF"/>
+          </w:tcPr>
+          <w:p/>
+        </w:tc>
+        <w:tc>
+          <w:tcPr>
+            <w:tcW w:type="dxa" w:w="1465"/>
+            <w:shd w:val="clear" w:color="auto" w:fill="F5F8FF"/>
+          </w:tcPr>
+          <w:p/>
+        </w:tc>
+      </w:tr>
+      <w:tr>
+        <w:tc>
+          <w:tcPr>
+            <w:tcW w:type="dxa" w:w="1465"/>
+            <w:vAlign w:val="top"/>
+          </w:tcPr>
+          <w:p>
+            <w:pPr>
+              <w:jc w:val="left"/>
+            </w:pPr>
+            <w:r>
+              <w:rPr>
+                <w:color w:val="373737"/>
+                <w:sz w:val="18"/>
+              </w:rPr>
+              <w:t xml:space="preserve">🔴🔬 </w:t>
+            </w:r>
+            <w:r>
+              <w:rPr>
+                <w:rFonts w:ascii="Courier New" w:hAnsi="Courier New"/>
+                <w:sz w:val="18"/>
+              </w:rPr>
+              <w:t>SPARK-PROD-E02</w:t>
+            </w:r>
+            <w:r>
+              <w:rPr>
+                <w:color w:val="373737"/>
+                <w:sz w:val="18"/>
+              </w:rPr>
+              <w:t xml:space="preserve"> </w:t>
+            </w:r>
+            <w:r>
+              <w:rPr>
+                <w:rFonts w:ascii="Courier New" w:hAnsi="Courier New"/>
+                <w:sz w:val="18"/>
+              </w:rPr>
+              <w:t>updateComponentStatuses</w:t>
+            </w:r>
+            <w:r>
+              <w:rPr>
+                <w:color w:val="373737"/>
+                <w:sz w:val="18"/>
+              </w:rPr>
+              <w:t xml:space="preserve"> (5-loader fan-out)</w:t>
+            </w:r>
+          </w:p>
+        </w:tc>
+        <w:tc>
+          <w:tcPr>
+            <w:tcW w:type="dxa" w:w="1465"/>
+            <w:vAlign w:val="top"/>
+          </w:tcPr>
+          <w:p>
+            <w:pPr>
+              <w:jc w:val="left"/>
+            </w:pPr>
+            <w:r>
+              <w:rPr>
+                <w:color w:val="373737"/>
+                <w:sz w:val="18"/>
+              </w:rPr>
+              <w:t>product</w:t>
+            </w:r>
+          </w:p>
+        </w:tc>
+        <w:tc>
+          <w:tcPr>
+            <w:tcW w:type="dxa" w:w="1465"/>
+            <w:vAlign w:val="top"/>
+          </w:tcPr>
+          <w:p>
+            <w:pPr>
+              <w:jc w:val="left"/>
+            </w:pPr>
+            <w:r>
+              <w:rPr>
+                <w:color w:val="373737"/>
+                <w:sz w:val="18"/>
+              </w:rPr>
+              <w:t>Mutation</w:t>
+            </w:r>
+          </w:p>
+        </w:tc>
+        <w:tc>
+          <w:tcPr>
+            <w:tcW w:type="dxa" w:w="1465"/>
+            <w:vAlign w:val="top"/>
+          </w:tcPr>
+          <w:p>
+            <w:pPr>
+              <w:jc w:val="left"/>
+            </w:pPr>
+            <w:r>
+              <w:rPr>
+                <w:rFonts w:ascii="Courier New" w:hAnsi="Courier New"/>
+                <w:sz w:val="18"/>
+              </w:rPr>
+              <w:t>claim</w:t>
+            </w:r>
+          </w:p>
+        </w:tc>
+        <w:tc>
+          <w:tcPr>
+            <w:tcW w:type="dxa" w:w="1465"/>
+            <w:vAlign w:val="top"/>
+          </w:tcPr>
+          <w:p>
+            <w:pPr>
+              <w:jc w:val="left"/>
+            </w:pPr>
+            <w:r>
+              <w:rPr>
+                <w:color w:val="373737"/>
+                <w:sz w:val="18"/>
+              </w:rPr>
+              <w:t>updating component statuses fans out to 5 places in parallel (bom, - measurement, productDetail, packaging — all internal — plus claim, external). - The bug: a loop…</w:t>
+            </w:r>
+          </w:p>
+        </w:tc>
+        <w:tc>
+          <w:tcPr>
+            <w:tcW w:type="dxa" w:w="1465"/>
+          </w:tcPr>
+          <w:p/>
+        </w:tc>
+        <w:tc>
+          <w:tcPr>
+            <w:tcW w:type="dxa" w:w="1465"/>
+          </w:tcPr>
+          <w:p/>
+        </w:tc>
+      </w:tr>
+      <w:tr>
+        <w:tc>
+          <w:tcPr>
+            <w:tcW w:type="dxa" w:w="1465"/>
+            <w:shd w:val="clear" w:color="auto" w:fill="F5F8FF"/>
+            <w:vAlign w:val="top"/>
+          </w:tcPr>
+          <w:p>
+            <w:pPr>
+              <w:jc w:val="left"/>
+            </w:pPr>
+            <w:r>
+              <w:rPr>
+                <w:color w:val="373737"/>
+                <w:sz w:val="18"/>
+              </w:rPr>
+              <w:t xml:space="preserve">🔴🔬 </w:t>
+            </w:r>
+            <w:r>
+              <w:rPr>
+                <w:rFonts w:ascii="Courier New" w:hAnsi="Courier New"/>
+                <w:sz w:val="18"/>
+              </w:rPr>
+              <w:t>SPARK-PDTL-E01</w:t>
+            </w:r>
+            <w:r>
+              <w:rPr>
+                <w:color w:val="373737"/>
+                <w:sz w:val="18"/>
+              </w:rPr>
+              <w:t xml:space="preserve"> </w:t>
+            </w:r>
+            <w:r>
+              <w:rPr>
+                <w:rFonts w:ascii="Courier New" w:hAnsi="Courier New"/>
+                <w:sz w:val="18"/>
+              </w:rPr>
+              <w:t>updateProductDetailsSet</w:t>
+            </w:r>
+            <w:r>
+              <w:rPr>
+                <w:color w:val="373737"/>
+                <w:sz w:val="18"/>
+              </w:rPr>
+              <w:t xml:space="preserve"> (multi-step write)</w:t>
+            </w:r>
+          </w:p>
+        </w:tc>
+        <w:tc>
+          <w:tcPr>
+            <w:tcW w:type="dxa" w:w="1465"/>
+            <w:shd w:val="clear" w:color="auto" w:fill="F5F8FF"/>
+            <w:vAlign w:val="top"/>
+          </w:tcPr>
+          <w:p>
+            <w:pPr>
+              <w:jc w:val="left"/>
+            </w:pPr>
+            <w:r>
+              <w:rPr>
+                <w:color w:val="373737"/>
+                <w:sz w:val="18"/>
+              </w:rPr>
+              <w:t>productDetails</w:t>
+            </w:r>
+          </w:p>
+        </w:tc>
+        <w:tc>
+          <w:tcPr>
+            <w:tcW w:type="dxa" w:w="1465"/>
+            <w:shd w:val="clear" w:color="auto" w:fill="F5F8FF"/>
+            <w:vAlign w:val="top"/>
+          </w:tcPr>
+          <w:p>
+            <w:pPr>
+              <w:jc w:val="left"/>
+            </w:pPr>
+            <w:r>
+              <w:rPr>
+                <w:color w:val="373737"/>
+                <w:sz w:val="18"/>
+              </w:rPr>
+              <w:t>Mutation</w:t>
+            </w:r>
+          </w:p>
+        </w:tc>
+        <w:tc>
+          <w:tcPr>
+            <w:tcW w:type="dxa" w:w="1465"/>
+            <w:shd w:val="clear" w:color="auto" w:fill="F5F8FF"/>
+            <w:vAlign w:val="top"/>
+          </w:tcPr>
+          <w:p>
+            <w:pPr>
+              <w:jc w:val="left"/>
+            </w:pPr>
+            <w:r>
+              <w:rPr>
+                <w:rFonts w:ascii="Courier New" w:hAnsi="Courier New"/>
+                <w:sz w:val="18"/>
+              </w:rPr>
+              <w:t>attachment</w:t>
+            </w:r>
+            <w:r>
+              <w:rPr>
+                <w:color w:val="373737"/>
+                <w:sz w:val="18"/>
+              </w:rPr>
+              <w:t xml:space="preserve">, </w:t>
+            </w:r>
+            <w:r>
+              <w:rPr>
+                <w:rFonts w:ascii="Courier New" w:hAnsi="Courier New"/>
+                <w:sz w:val="18"/>
+              </w:rPr>
+              <w:t>workspaceV2</w:t>
+            </w:r>
+          </w:p>
+        </w:tc>
+        <w:tc>
+          <w:tcPr>
+            <w:tcW w:type="dxa" w:w="1465"/>
+            <w:shd w:val="clear" w:color="auto" w:fill="F5F8FF"/>
+            <w:vAlign w:val="top"/>
+          </w:tcPr>
+          <w:p>
+            <w:pPr>
+              <w:jc w:val="left"/>
+            </w:pPr>
+            <w:r>
+              <w:rPr>
+                <w:color w:val="373737"/>
+                <w:sz w:val="18"/>
+              </w:rPr>
               <w:t>if workspaceContext.{add,remove}Workspaces non-empty → workspaceAssociationHelper(PRODUCT_DETAIL, id, add, remove) (throws on error); 2) null workspaceContext; 3) if…</w:t>
+            </w:r>
+          </w:p>
+        </w:tc>
+        <w:tc>
+          <w:tcPr>
+            <w:tcW w:type="dxa" w:w="1465"/>
+            <w:shd w:val="clear" w:color="auto" w:fill="F5F8FF"/>
+          </w:tcPr>
+          <w:p/>
+        </w:tc>
+        <w:tc>
+          <w:tcPr>
+            <w:tcW w:type="dxa" w:w="1465"/>
+            <w:shd w:val="clear" w:color="auto" w:fill="F5F8FF"/>
+          </w:tcPr>
+          <w:p/>
+        </w:tc>
+      </w:tr>
+      <w:tr>
+        <w:tc>
+          <w:tcPr>
+            <w:tcW w:type="dxa" w:w="1465"/>
+            <w:vAlign w:val="top"/>
+          </w:tcPr>
+          <w:p>
+            <w:pPr>
+              <w:jc w:val="left"/>
+            </w:pPr>
+            <w:r>
+              <w:rPr>
+                <w:color w:val="373737"/>
+                <w:sz w:val="18"/>
+              </w:rPr>
+              <w:t xml:space="preserve">🔴🔬 </w:t>
+            </w:r>
+            <w:r>
+              <w:rPr>
+                <w:rFonts w:ascii="Courier New" w:hAnsi="Courier New"/>
+                <w:sz w:val="18"/>
+              </w:rPr>
+              <w:t>SPARK-SMPL-E01</w:t>
+            </w:r>
+            <w:r>
+              <w:rPr>
+                <w:color w:val="373737"/>
+                <w:sz w:val="18"/>
+              </w:rPr>
+              <w:t xml:space="preserve"> </w:t>
+            </w:r>
+            <w:r>
+              <w:rPr>
+                <w:rFonts w:ascii="Courier New" w:hAnsi="Courier New"/>
+                <w:sz w:val="18"/>
+              </w:rPr>
+              <w:t>updateSamplesV2</w:t>
+            </w:r>
+          </w:p>
+        </w:tc>
+        <w:tc>
+          <w:tcPr>
+            <w:tcW w:type="dxa" w:w="1465"/>
+            <w:vAlign w:val="top"/>
+          </w:tcPr>
+          <w:p>
+            <w:pPr>
+              <w:jc w:val="left"/>
+            </w:pPr>
+            <w:r>
+              <w:rPr>
+                <w:color w:val="373737"/>
+                <w:sz w:val="18"/>
+              </w:rPr>
+              <w:t>sample</w:t>
+            </w:r>
+          </w:p>
+        </w:tc>
+        <w:tc>
+          <w:tcPr>
+            <w:tcW w:type="dxa" w:w="1465"/>
+            <w:vAlign w:val="top"/>
+          </w:tcPr>
+          <w:p>
+            <w:pPr>
+              <w:jc w:val="left"/>
+            </w:pPr>
+            <w:r>
+              <w:rPr>
+                <w:color w:val="373737"/>
+                <w:sz w:val="18"/>
+              </w:rPr>
+              <w:t>Mutation</w:t>
+            </w:r>
+          </w:p>
+        </w:tc>
+        <w:tc>
+          <w:tcPr>
+            <w:tcW w:type="dxa" w:w="1465"/>
+            <w:vAlign w:val="top"/>
+          </w:tcPr>
+          <w:p>
+            <w:pPr>
+              <w:jc w:val="left"/>
+            </w:pPr>
+            <w:r>
+              <w:rPr>
+                <w:color w:val="373737"/>
+                <w:sz w:val="18"/>
+              </w:rPr>
+              <w:t>— (internal only)</w:t>
+            </w:r>
+          </w:p>
+        </w:tc>
+        <w:tc>
+          <w:tcPr>
+            <w:tcW w:type="dxa" w:w="1465"/>
+            <w:vAlign w:val="top"/>
+          </w:tcPr>
+          <w:p>
+            <w:pPr>
+              <w:jc w:val="left"/>
+            </w:pPr>
+            <w:r>
+              <w:rPr>
+                <w:color w:val="373737"/>
+                <w:sz w:val="18"/>
+              </w:rPr>
+              <w:t>token for all updateSamples[].id + SAMPLE_EVALUTION → updateSamplesV2</w:t>
+            </w:r>
+          </w:p>
+        </w:tc>
+        <w:tc>
+          <w:tcPr>
+            <w:tcW w:type="dxa" w:w="1465"/>
+          </w:tcPr>
+          <w:p/>
+        </w:tc>
+        <w:tc>
+          <w:tcPr>
+            <w:tcW w:type="dxa" w:w="1465"/>
+          </w:tcPr>
+          <w:p/>
+        </w:tc>
+      </w:tr>
+      <w:tr>
+        <w:tc>
+          <w:tcPr>
+            <w:tcW w:type="dxa" w:w="1465"/>
+            <w:shd w:val="clear" w:color="auto" w:fill="F5F8FF"/>
+            <w:vAlign w:val="top"/>
+          </w:tcPr>
+          <w:p>
+            <w:pPr>
+              <w:jc w:val="left"/>
+            </w:pPr>
+            <w:r>
+              <w:rPr>
+                <w:color w:val="373737"/>
+                <w:sz w:val="18"/>
+              </w:rPr>
+              <w:t xml:space="preserve">🔴🔬 </w:t>
+            </w:r>
+            <w:r>
+              <w:rPr>
+                <w:rFonts w:ascii="Courier New" w:hAnsi="Courier New"/>
+                <w:sz w:val="18"/>
+              </w:rPr>
+              <w:t>SPARK-SMPL-E02</w:t>
+            </w:r>
+            <w:r>
+              <w:rPr>
+                <w:color w:val="373737"/>
+                <w:sz w:val="18"/>
+              </w:rPr>
+              <w:t xml:space="preserve"> </w:t>
+            </w:r>
+            <w:r>
+              <w:rPr>
+                <w:rFonts w:ascii="Courier New" w:hAnsi="Courier New"/>
+                <w:sz w:val="18"/>
+              </w:rPr>
+              <w:t>bulkEvaluateSamples</w:t>
+            </w:r>
+          </w:p>
+        </w:tc>
+        <w:tc>
+          <w:tcPr>
+            <w:tcW w:type="dxa" w:w="1465"/>
+            <w:shd w:val="clear" w:color="auto" w:fill="F5F8FF"/>
+            <w:vAlign w:val="top"/>
+          </w:tcPr>
+          <w:p>
+            <w:pPr>
+              <w:jc w:val="left"/>
+            </w:pPr>
+            <w:r>
+              <w:rPr>
+                <w:color w:val="373737"/>
+                <w:sz w:val="18"/>
+              </w:rPr>
+              <w:t>sample</w:t>
+            </w:r>
+          </w:p>
+        </w:tc>
+        <w:tc>
+          <w:tcPr>
+            <w:tcW w:type="dxa" w:w="1465"/>
+            <w:shd w:val="clear" w:color="auto" w:fill="F5F8FF"/>
+            <w:vAlign w:val="top"/>
+          </w:tcPr>
+          <w:p>
+            <w:pPr>
+              <w:jc w:val="left"/>
+            </w:pPr>
+            <w:r>
+              <w:rPr>
+                <w:color w:val="373737"/>
+                <w:sz w:val="18"/>
+              </w:rPr>
+              <w:t>Mutation</w:t>
+            </w:r>
+          </w:p>
+        </w:tc>
+        <w:tc>
+          <w:tcPr>
+            <w:tcW w:type="dxa" w:w="1465"/>
+            <w:shd w:val="clear" w:color="auto" w:fill="F5F8FF"/>
+            <w:vAlign w:val="top"/>
+          </w:tcPr>
+          <w:p>
+            <w:pPr>
+              <w:jc w:val="left"/>
+            </w:pPr>
+            <w:r>
+              <w:rPr>
+                <w:rFonts w:ascii="Courier New" w:hAnsi="Courier New"/>
+                <w:sz w:val="18"/>
+              </w:rPr>
+              <w:t>attachment</w:t>
+            </w:r>
+          </w:p>
+        </w:tc>
+        <w:tc>
+          <w:tcPr>
+            <w:tcW w:type="dxa" w:w="1465"/>
+            <w:shd w:val="clear" w:color="auto" w:fill="F5F8FF"/>
+            <w:vAlign w:val="top"/>
+          </w:tcPr>
+          <w:p>
+            <w:pPr>
+              <w:jc w:val="left"/>
+            </w:pPr>
+            <w:r>
+              <w:rPr>
+                <w:color w:val="373737"/>
+                <w:sz w:val="18"/>
+              </w:rPr>
+              <w:t>delegates to bulkEvaluateSampleUtil(ctx, updateSamples, newSampleRounds) — applies evaluations and creates new sample rounds</w:t>
             </w:r>
           </w:p>
         </w:tc>
@@ -8745,6 +10360,173 @@
           </w:p>
         </w:tc>
       </w:tr>
+      <w:tr>
+        <w:tc>
+          <w:tcPr>
+            <w:tcW w:type="dxa" w:w="2051"/>
+            <w:shd w:val="clear" w:color="auto" w:fill="F5F8FF"/>
+            <w:vAlign w:val="top"/>
+          </w:tcPr>
+          <w:p>
+            <w:pPr>
+              <w:jc w:val="left"/>
+            </w:pPr>
+            <w:r>
+              <w:rPr>
+                <w:color w:val="373737"/>
+                <w:sz w:val="18"/>
+              </w:rPr>
+              <w:t xml:space="preserve">🔴🔬 </w:t>
+            </w:r>
+            <w:r>
+              <w:rPr>
+                <w:rFonts w:ascii="Courier New" w:hAnsi="Courier New"/>
+                <w:sz w:val="18"/>
+              </w:rPr>
+              <w:t>SPARK-WS-E01</w:t>
+            </w:r>
+            <w:r>
+              <w:rPr>
+                <w:color w:val="373737"/>
+                <w:sz w:val="18"/>
+              </w:rPr>
+              <w:t xml:space="preserve"> </w:t>
+            </w:r>
+            <w:r>
+              <w:rPr>
+                <w:rFonts w:ascii="Courier New" w:hAnsi="Courier New"/>
+                <w:sz w:val="18"/>
+              </w:rPr>
+              <w:t>workspaceBusinessPartnerActionsV2</w:t>
+            </w:r>
+            <w:r>
+              <w:rPr>
+                <w:color w:val="373737"/>
+                <w:sz w:val="18"/>
+              </w:rPr>
+              <w:t xml:space="preserve"> (5-case drop/undrop dispatcher)</w:t>
+            </w:r>
+          </w:p>
+        </w:tc>
+        <w:tc>
+          <w:tcPr>
+            <w:tcW w:type="dxa" w:w="2051"/>
+            <w:shd w:val="clear" w:color="auto" w:fill="F5F8FF"/>
+            <w:vAlign w:val="top"/>
+          </w:tcPr>
+          <w:p>
+            <w:pPr>
+              <w:jc w:val="left"/>
+            </w:pPr>
+            <w:r>
+              <w:rPr>
+                <w:color w:val="373737"/>
+                <w:sz w:val="18"/>
+              </w:rPr>
+              <w:t>workspace</w:t>
+            </w:r>
+          </w:p>
+        </w:tc>
+        <w:tc>
+          <w:tcPr>
+            <w:tcW w:type="dxa" w:w="2051"/>
+            <w:shd w:val="clear" w:color="auto" w:fill="F5F8FF"/>
+            <w:vAlign w:val="top"/>
+          </w:tcPr>
+          <w:p>
+            <w:pPr>
+              <w:jc w:val="left"/>
+            </w:pPr>
+            <w:r>
+              <w:rPr>
+                <w:color w:val="373737"/>
+                <w:sz w:val="18"/>
+              </w:rPr>
+              <w:t>Mutation</w:t>
+            </w:r>
+          </w:p>
+        </w:tc>
+        <w:tc>
+          <w:tcPr>
+            <w:tcW w:type="dxa" w:w="2051"/>
+            <w:shd w:val="clear" w:color="auto" w:fill="F5F8FF"/>
+            <w:vAlign w:val="top"/>
+          </w:tcPr>
+          <w:p>
+            <w:pPr>
+              <w:jc w:val="left"/>
+            </w:pPr>
+            <w:r>
+              <w:rPr>
+                <w:rFonts w:ascii="Courier New" w:hAnsi="Courier New"/>
+                <w:sz w:val="18"/>
+              </w:rPr>
+              <w:t>relationship</w:t>
+            </w:r>
+            <w:r>
+              <w:rPr>
+                <w:color w:val="373737"/>
+                <w:sz w:val="18"/>
+              </w:rPr>
+              <w:t xml:space="preserve">, </w:t>
+            </w:r>
+            <w:r>
+              <w:rPr>
+                <w:rFonts w:ascii="Courier New" w:hAnsi="Courier New"/>
+                <w:sz w:val="18"/>
+              </w:rPr>
+              <w:t>discussion</w:t>
+            </w:r>
+            <w:r>
+              <w:rPr>
+                <w:color w:val="373737"/>
+                <w:sz w:val="18"/>
+              </w:rPr>
+              <w:t xml:space="preserve">, </w:t>
+            </w:r>
+            <w:r>
+              <w:rPr>
+                <w:rFonts w:ascii="Courier New" w:hAnsi="Courier New"/>
+                <w:sz w:val="18"/>
+              </w:rPr>
+              <w:t>sampleV2</w:t>
+            </w:r>
+            <w:r>
+              <w:rPr>
+                <w:color w:val="373737"/>
+                <w:sz w:val="18"/>
+              </w:rPr>
+              <w:t xml:space="preserve">, </w:t>
+            </w:r>
+            <w:r>
+              <w:rPr>
+                <w:rFonts w:ascii="Courier New" w:hAnsi="Courier New"/>
+                <w:sz w:val="18"/>
+              </w:rPr>
+              <w:t>favorite</w:t>
+            </w:r>
+          </w:p>
+        </w:tc>
+        <w:tc>
+          <w:tcPr>
+            <w:tcW w:type="dxa" w:w="2051"/>
+            <w:shd w:val="clear" w:color="auto" w:fill="F5F8FF"/>
+            <w:vAlign w:val="top"/>
+          </w:tcPr>
+          <w:p>
+            <w:pPr>
+              <w:jc w:val="left"/>
+            </w:pPr>
+            <w:r>
+              <w:rPr>
+                <w:color w:val="373737"/>
+                <w:sz w:val="18"/>
+              </w:rPr>
+              <w:t>~310-line switch — REMOVE_TEAM, REMOVE_PARTNER, DROP_PARTNER, - UNDO_DROP_PARTNER, DROP_UNDROP_PARTNER. - Builds a relationship tree (relationship), ACL-filters…</w:t>
+            </w:r>
+          </w:p>
+        </w:tc>
+      </w:tr>
     </w:tbl>
     <w:p/>
     <w:p>
@@ -9295,6 +11077,173 @@
           </w:p>
         </w:tc>
       </w:tr>
+      <w:tr>
+        <w:tc>
+          <w:tcPr>
+            <w:tcW w:type="dxa" w:w="2051"/>
+            <w:shd w:val="clear" w:color="auto" w:fill="F5F8FF"/>
+            <w:vAlign w:val="top"/>
+          </w:tcPr>
+          <w:p>
+            <w:pPr>
+              <w:jc w:val="left"/>
+            </w:pPr>
+            <w:r>
+              <w:rPr>
+                <w:color w:val="373737"/>
+                <w:sz w:val="18"/>
+              </w:rPr>
+              <w:t xml:space="preserve">🔴🔬 </w:t>
+            </w:r>
+            <w:r>
+              <w:rPr>
+                <w:rFonts w:ascii="Courier New" w:hAnsi="Courier New"/>
+                <w:sz w:val="18"/>
+              </w:rPr>
+              <w:t>SPARK-WS-G05</w:t>
+            </w:r>
+            <w:r>
+              <w:rPr>
+                <w:color w:val="373737"/>
+                <w:sz w:val="18"/>
+              </w:rPr>
+              <w:t xml:space="preserve"> partners (</w:t>
+            </w:r>
+            <w:r>
+              <w:rPr>
+                <w:rFonts w:ascii="Courier New" w:hAnsi="Courier New"/>
+                <w:sz w:val="18"/>
+              </w:rPr>
+              <w:t>businessPartners</w:t>
+            </w:r>
+            <w:r>
+              <w:rPr>
+                <w:color w:val="373737"/>
+                <w:sz w:val="18"/>
+              </w:rPr>
+              <w:t>/</w:t>
+            </w:r>
+            <w:r>
+              <w:rPr>
+                <w:rFonts w:ascii="Courier New" w:hAnsi="Courier New"/>
+                <w:sz w:val="18"/>
+              </w:rPr>
+              <w:t>droppedPartners</w:t>
+            </w:r>
+            <w:r>
+              <w:rPr>
+                <w:color w:val="373737"/>
+                <w:sz w:val="18"/>
+              </w:rPr>
+              <w:t>/</w:t>
+            </w:r>
+            <w:r>
+              <w:rPr>
+                <w:rFonts w:ascii="Courier New" w:hAnsi="Courier New"/>
+                <w:sz w:val="18"/>
+              </w:rPr>
+              <w:t>notRemovablePartnerIds</w:t>
+            </w:r>
+            <w:r>
+              <w:rPr>
+                <w:color w:val="373737"/>
+                <w:sz w:val="18"/>
+              </w:rPr>
+              <w:t>/</w:t>
+            </w:r>
+            <w:r>
+              <w:rPr>
+                <w:rFonts w:ascii="Courier New" w:hAnsi="Courier New"/>
+                <w:sz w:val="18"/>
+              </w:rPr>
+              <w:t>unDroppablePartners</w:t>
+            </w:r>
+            <w:r>
+              <w:rPr>
+                <w:color w:val="373737"/>
+                <w:sz w:val="18"/>
+              </w:rPr>
+              <w:t>)</w:t>
+            </w:r>
+          </w:p>
+        </w:tc>
+        <w:tc>
+          <w:tcPr>
+            <w:tcW w:type="dxa" w:w="2051"/>
+            <w:shd w:val="clear" w:color="auto" w:fill="F5F8FF"/>
+            <w:vAlign w:val="top"/>
+          </w:tcPr>
+          <w:p>
+            <w:pPr>
+              <w:jc w:val="left"/>
+            </w:pPr>
+            <w:r>
+              <w:rPr>
+                <w:color w:val="373737"/>
+                <w:sz w:val="18"/>
+              </w:rPr>
+              <w:t>workspace</w:t>
+            </w:r>
+          </w:p>
+        </w:tc>
+        <w:tc>
+          <w:tcPr>
+            <w:tcW w:type="dxa" w:w="2051"/>
+            <w:shd w:val="clear" w:color="auto" w:fill="F5F8FF"/>
+            <w:vAlign w:val="top"/>
+          </w:tcPr>
+          <w:p>
+            <w:pPr>
+              <w:jc w:val="left"/>
+            </w:pPr>
+            <w:r>
+              <w:rPr>
+                <w:color w:val="373737"/>
+                <w:sz w:val="18"/>
+              </w:rPr>
+              <w:t>Field resolver</w:t>
+            </w:r>
+          </w:p>
+        </w:tc>
+        <w:tc>
+          <w:tcPr>
+            <w:tcW w:type="dxa" w:w="2051"/>
+            <w:shd w:val="clear" w:color="auto" w:fill="F5F8FF"/>
+            <w:vAlign w:val="top"/>
+          </w:tcPr>
+          <w:p>
+            <w:pPr>
+              <w:jc w:val="left"/>
+            </w:pPr>
+            <w:r>
+              <w:rPr>
+                <w:rFonts w:ascii="Courier New" w:hAnsi="Courier New"/>
+                <w:sz w:val="18"/>
+              </w:rPr>
+              <w:t>vmm</w:t>
+            </w:r>
+          </w:p>
+        </w:tc>
+        <w:tc>
+          <w:tcPr>
+            <w:tcW w:type="dxa" w:w="2051"/>
+            <w:shd w:val="clear" w:color="auto" w:fill="F5F8FF"/>
+            <w:vAlign w:val="top"/>
+          </w:tcPr>
+          <w:p>
+            <w:pPr>
+              <w:jc w:val="left"/>
+            </w:pPr>
+            <w:r>
+              <w:rPr>
+                <w:color w:val="373737"/>
+                <w:sz w:val="18"/>
+              </w:rPr>
+              <w:t>—</w:t>
+            </w:r>
+          </w:p>
+        </w:tc>
+      </w:tr>
     </w:tbl>
     <w:p/>
     <w:p>
@@ -9773,6 +11722,230 @@
                 <w:sz w:val="18"/>
               </w:rPr>
               <w:t>- Material: switch on material.materialCategory.code → 4→Trim, 6→Wash, 2→Fabric, 15→Combination, 16→FabricSpec, {10,11,12,13,14,17–24}→Packaging, default…</w:t>
+            </w:r>
+          </w:p>
+        </w:tc>
+      </w:tr>
+      <w:tr>
+        <w:tc>
+          <w:tcPr>
+            <w:tcW w:type="dxa" w:w="2051"/>
+            <w:shd w:val="clear" w:color="auto" w:fill="F5F8FF"/>
+            <w:vAlign w:val="top"/>
+          </w:tcPr>
+          <w:p>
+            <w:pPr>
+              <w:jc w:val="left"/>
+            </w:pPr>
+            <w:r>
+              <w:rPr>
+                <w:color w:val="373737"/>
+                <w:sz w:val="18"/>
+              </w:rPr>
+              <w:t xml:space="preserve">🔴🔬 </w:t>
+            </w:r>
+            <w:r>
+              <w:rPr>
+                <w:rFonts w:ascii="Courier New" w:hAnsi="Courier New"/>
+                <w:sz w:val="18"/>
+              </w:rPr>
+              <w:t>SPARK-SMPL-B01</w:t>
+            </w:r>
+            <w:r>
+              <w:rPr>
+                <w:color w:val="373737"/>
+                <w:sz w:val="18"/>
+              </w:rPr>
+              <w:t xml:space="preserve"> </w:t>
+            </w:r>
+            <w:r>
+              <w:rPr>
+                <w:rFonts w:ascii="Courier New" w:hAnsi="Courier New"/>
+                <w:sz w:val="18"/>
+              </w:rPr>
+              <w:t>getSampleById(id)</w:t>
+            </w:r>
+          </w:p>
+        </w:tc>
+        <w:tc>
+          <w:tcPr>
+            <w:tcW w:type="dxa" w:w="2051"/>
+            <w:shd w:val="clear" w:color="auto" w:fill="F5F8FF"/>
+            <w:vAlign w:val="top"/>
+          </w:tcPr>
+          <w:p>
+            <w:pPr>
+              <w:jc w:val="left"/>
+            </w:pPr>
+            <w:r>
+              <w:rPr>
+                <w:color w:val="373737"/>
+                <w:sz w:val="18"/>
+              </w:rPr>
+              <w:t>sample</w:t>
+            </w:r>
+          </w:p>
+        </w:tc>
+        <w:tc>
+          <w:tcPr>
+            <w:tcW w:type="dxa" w:w="2051"/>
+            <w:shd w:val="clear" w:color="auto" w:fill="F5F8FF"/>
+            <w:vAlign w:val="top"/>
+          </w:tcPr>
+          <w:p>
+            <w:pPr>
+              <w:jc w:val="left"/>
+            </w:pPr>
+            <w:r>
+              <w:rPr>
+                <w:color w:val="373737"/>
+                <w:sz w:val="18"/>
+              </w:rPr>
+              <w:t>Query</w:t>
+            </w:r>
+          </w:p>
+        </w:tc>
+        <w:tc>
+          <w:tcPr>
+            <w:tcW w:type="dxa" w:w="2051"/>
+            <w:shd w:val="clear" w:color="auto" w:fill="F5F8FF"/>
+            <w:vAlign w:val="top"/>
+          </w:tcPr>
+          <w:p>
+            <w:pPr>
+              <w:jc w:val="left"/>
+            </w:pPr>
+            <w:r>
+              <w:rPr>
+                <w:color w:val="373737"/>
+                <w:sz w:val="18"/>
+              </w:rPr>
+              <w:t>— (internal only)</w:t>
+            </w:r>
+          </w:p>
+        </w:tc>
+        <w:tc>
+          <w:tcPr>
+            <w:tcW w:type="dxa" w:w="2051"/>
+            <w:shd w:val="clear" w:color="auto" w:fill="F5F8FF"/>
+            <w:vAlign w:val="top"/>
+          </w:tcPr>
+          <w:p>
+            <w:pPr>
+              <w:jc w:val="left"/>
+            </w:pPr>
+            <w:r>
+              <w:rPr>
+                <w:color w:val="373737"/>
+                <w:sz w:val="18"/>
+              </w:rPr>
+              <w:t>getSampleById</w:t>
+            </w:r>
+          </w:p>
+        </w:tc>
+      </w:tr>
+      <w:tr>
+        <w:tc>
+          <w:tcPr>
+            <w:tcW w:type="dxa" w:w="2051"/>
+            <w:vAlign w:val="top"/>
+          </w:tcPr>
+          <w:p>
+            <w:pPr>
+              <w:jc w:val="left"/>
+            </w:pPr>
+            <w:r>
+              <w:rPr>
+                <w:color w:val="373737"/>
+                <w:sz w:val="18"/>
+              </w:rPr>
+              <w:t xml:space="preserve">🔴🔬 </w:t>
+            </w:r>
+            <w:r>
+              <w:rPr>
+                <w:rFonts w:ascii="Courier New" w:hAnsi="Courier New"/>
+                <w:sz w:val="18"/>
+              </w:rPr>
+              <w:t>SPARK-SRCH-A02</w:t>
+            </w:r>
+            <w:r>
+              <w:rPr>
+                <w:color w:val="373737"/>
+                <w:sz w:val="18"/>
+              </w:rPr>
+              <w:t xml:space="preserve"> Owned result types + inputs (the big surface)</w:t>
+            </w:r>
+          </w:p>
+        </w:tc>
+        <w:tc>
+          <w:tcPr>
+            <w:tcW w:type="dxa" w:w="2051"/>
+            <w:vAlign w:val="top"/>
+          </w:tcPr>
+          <w:p>
+            <w:pPr>
+              <w:jc w:val="left"/>
+            </w:pPr>
+            <w:r>
+              <w:rPr>
+                <w:color w:val="373737"/>
+                <w:sz w:val="18"/>
+              </w:rPr>
+              <w:t>search</w:t>
+            </w:r>
+          </w:p>
+        </w:tc>
+        <w:tc>
+          <w:tcPr>
+            <w:tcW w:type="dxa" w:w="2051"/>
+            <w:vAlign w:val="top"/>
+          </w:tcPr>
+          <w:p>
+            <w:pPr>
+              <w:jc w:val="left"/>
+            </w:pPr>
+            <w:r>
+              <w:rPr>
+                <w:color w:val="373737"/>
+                <w:sz w:val="18"/>
+              </w:rPr>
+              <w:t>Story</w:t>
+            </w:r>
+          </w:p>
+        </w:tc>
+        <w:tc>
+          <w:tcPr>
+            <w:tcW w:type="dxa" w:w="2051"/>
+            <w:vAlign w:val="top"/>
+          </w:tcPr>
+          <w:p>
+            <w:pPr>
+              <w:jc w:val="left"/>
+            </w:pPr>
+            <w:r>
+              <w:rPr>
+                <w:color w:val="373737"/>
+                <w:sz w:val="18"/>
+              </w:rPr>
+              <w:t>— (internal only)</w:t>
+            </w:r>
+          </w:p>
+        </w:tc>
+        <w:tc>
+          <w:tcPr>
+            <w:tcW w:type="dxa" w:w="2051"/>
+            <w:vAlign w:val="top"/>
+          </w:tcPr>
+          <w:p>
+            <w:pPr>
+              <w:jc w:val="left"/>
+            </w:pPr>
+            <w:r>
+              <w:rPr>
+                <w:color w:val="373737"/>
+                <w:sz w:val="18"/>
+              </w:rPr>
+              <w:t>all ~50 owned result/value types (SearchAttachment, Material, SearchCombination</w:t>
             </w:r>
           </w:p>
         </w:tc>
@@ -11271,6 +13444,328 @@
                 <w:sz w:val="18"/>
               </w:rPr>
               <w:t>PUT ${v1}/{productId} workspace attrs</w:t>
+            </w:r>
+          </w:p>
+        </w:tc>
+      </w:tr>
+      <w:tr>
+        <w:tc>
+          <w:tcPr>
+            <w:tcW w:type="dxa" w:w="2051"/>
+            <w:shd w:val="clear" w:color="auto" w:fill="F5F8FF"/>
+            <w:vAlign w:val="top"/>
+          </w:tcPr>
+          <w:p>
+            <w:pPr>
+              <w:jc w:val="left"/>
+            </w:pPr>
+            <w:r>
+              <w:rPr>
+                <w:color w:val="373737"/>
+                <w:sz w:val="18"/>
+              </w:rPr>
+              <w:t xml:space="preserve">🔴🔬 </w:t>
+            </w:r>
+            <w:r>
+              <w:rPr>
+                <w:rFonts w:ascii="Courier New" w:hAnsi="Courier New"/>
+                <w:sz w:val="18"/>
+              </w:rPr>
+              <w:t>SPARK-WS-D04</w:t>
+            </w:r>
+            <w:r>
+              <w:rPr>
+                <w:color w:val="373737"/>
+                <w:sz w:val="18"/>
+              </w:rPr>
+              <w:t xml:space="preserve"> </w:t>
+            </w:r>
+            <w:r>
+              <w:rPr>
+                <w:rFonts w:ascii="Courier New" w:hAnsi="Courier New"/>
+                <w:sz w:val="18"/>
+              </w:rPr>
+              <w:t>addResourcesToWorkspaceV2</w:t>
+            </w:r>
+          </w:p>
+        </w:tc>
+        <w:tc>
+          <w:tcPr>
+            <w:tcW w:type="dxa" w:w="2051"/>
+            <w:shd w:val="clear" w:color="auto" w:fill="F5F8FF"/>
+            <w:vAlign w:val="top"/>
+          </w:tcPr>
+          <w:p>
+            <w:pPr>
+              <w:jc w:val="left"/>
+            </w:pPr>
+            <w:r>
+              <w:rPr>
+                <w:color w:val="373737"/>
+                <w:sz w:val="18"/>
+              </w:rPr>
+              <w:t>workspace</w:t>
+            </w:r>
+          </w:p>
+        </w:tc>
+        <w:tc>
+          <w:tcPr>
+            <w:tcW w:type="dxa" w:w="2051"/>
+            <w:shd w:val="clear" w:color="auto" w:fill="F5F8FF"/>
+            <w:vAlign w:val="top"/>
+          </w:tcPr>
+          <w:p>
+            <w:pPr>
+              <w:jc w:val="left"/>
+            </w:pPr>
+            <w:r>
+              <w:rPr>
+                <w:color w:val="373737"/>
+                <w:sz w:val="18"/>
+              </w:rPr>
+              <w:t>Mutation</w:t>
+            </w:r>
+          </w:p>
+        </w:tc>
+        <w:tc>
+          <w:tcPr>
+            <w:tcW w:type="dxa" w:w="2051"/>
+            <w:shd w:val="clear" w:color="auto" w:fill="F5F8FF"/>
+            <w:vAlign w:val="top"/>
+          </w:tcPr>
+          <w:p>
+            <w:pPr>
+              <w:jc w:val="left"/>
+            </w:pPr>
+            <w:r>
+              <w:rPr>
+                <w:rFonts w:ascii="Courier New" w:hAnsi="Courier New"/>
+                <w:sz w:val="18"/>
+              </w:rPr>
+              <w:t>product</w:t>
+            </w:r>
+          </w:p>
+        </w:tc>
+        <w:tc>
+          <w:tcPr>
+            <w:tcW w:type="dxa" w:w="2051"/>
+            <w:shd w:val="clear" w:color="auto" w:fill="F5F8FF"/>
+            <w:vAlign w:val="top"/>
+          </w:tcPr>
+          <w:p>
+            <w:pPr>
+              <w:jc w:val="left"/>
+            </w:pPr>
+            <w:r>
+              <w:rPr>
+                <w:color w:val="373737"/>
+                <w:sz w:val="18"/>
+              </w:rPr>
+              <w:t>token; if single product → (product) read Product.workspaces + updateViewToggle (init workspace attrs; firstWorkspace adds designCycle/setDates); POST …</w:t>
+            </w:r>
+          </w:p>
+        </w:tc>
+      </w:tr>
+      <w:tr>
+        <w:tc>
+          <w:tcPr>
+            <w:tcW w:type="dxa" w:w="2051"/>
+            <w:vAlign w:val="top"/>
+          </w:tcPr>
+          <w:p>
+            <w:pPr>
+              <w:jc w:val="left"/>
+            </w:pPr>
+            <w:r>
+              <w:rPr>
+                <w:color w:val="373737"/>
+                <w:sz w:val="18"/>
+              </w:rPr>
+              <w:t xml:space="preserve">🔴🔬 </w:t>
+            </w:r>
+            <w:r>
+              <w:rPr>
+                <w:rFonts w:ascii="Courier New" w:hAnsi="Courier New"/>
+                <w:sz w:val="18"/>
+              </w:rPr>
+              <w:t>SPARK-WS-G04</w:t>
+            </w:r>
+            <w:r>
+              <w:rPr>
+                <w:color w:val="373737"/>
+                <w:sz w:val="18"/>
+              </w:rPr>
+              <w:t xml:space="preserve"> </w:t>
+            </w:r>
+            <w:r>
+              <w:rPr>
+                <w:rFonts w:ascii="Courier New" w:hAnsi="Courier New"/>
+                <w:sz w:val="18"/>
+              </w:rPr>
+              <w:t>products</w:t>
+            </w:r>
+            <w:r>
+              <w:rPr>
+                <w:color w:val="373737"/>
+                <w:sz w:val="18"/>
+              </w:rPr>
+              <w:t xml:space="preserve"> + </w:t>
+            </w:r>
+            <w:r>
+              <w:rPr>
+                <w:rFonts w:ascii="Courier New" w:hAnsi="Courier New"/>
+                <w:sz w:val="18"/>
+              </w:rPr>
+              <w:t>productsCount</w:t>
+            </w:r>
+            <w:r>
+              <w:rPr>
+                <w:color w:val="373737"/>
+                <w:sz w:val="18"/>
+              </w:rPr>
+              <w:t xml:space="preserve"> + </w:t>
+            </w:r>
+            <w:r>
+              <w:rPr>
+                <w:rFonts w:ascii="Courier New" w:hAnsi="Courier New"/>
+                <w:sz w:val="18"/>
+              </w:rPr>
+              <w:t>combinations</w:t>
+            </w:r>
+            <w:r>
+              <w:rPr>
+                <w:color w:val="373737"/>
+                <w:sz w:val="18"/>
+              </w:rPr>
+              <w:t xml:space="preserve"> + </w:t>
+            </w:r>
+            <w:r>
+              <w:rPr>
+                <w:rFonts w:ascii="Courier New" w:hAnsi="Courier New"/>
+                <w:sz w:val="18"/>
+              </w:rPr>
+              <w:t>sampleReport</w:t>
+            </w:r>
+            <w:r>
+              <w:rPr>
+                <w:color w:val="373737"/>
+                <w:sz w:val="18"/>
+              </w:rPr>
+              <w:t xml:space="preserve"> (cross-subgraph)</w:t>
+            </w:r>
+          </w:p>
+        </w:tc>
+        <w:tc>
+          <w:tcPr>
+            <w:tcW w:type="dxa" w:w="2051"/>
+            <w:vAlign w:val="top"/>
+          </w:tcPr>
+          <w:p>
+            <w:pPr>
+              <w:jc w:val="left"/>
+            </w:pPr>
+            <w:r>
+              <w:rPr>
+                <w:color w:val="373737"/>
+                <w:sz w:val="18"/>
+              </w:rPr>
+              <w:t>workspace</w:t>
+            </w:r>
+          </w:p>
+        </w:tc>
+        <w:tc>
+          <w:tcPr>
+            <w:tcW w:type="dxa" w:w="2051"/>
+            <w:vAlign w:val="top"/>
+          </w:tcPr>
+          <w:p>
+            <w:pPr>
+              <w:jc w:val="left"/>
+            </w:pPr>
+            <w:r>
+              <w:rPr>
+                <w:color w:val="373737"/>
+                <w:sz w:val="18"/>
+              </w:rPr>
+              <w:t>Field resolver</w:t>
+            </w:r>
+          </w:p>
+        </w:tc>
+        <w:tc>
+          <w:tcPr>
+            <w:tcW w:type="dxa" w:w="2051"/>
+            <w:vAlign w:val="top"/>
+          </w:tcPr>
+          <w:p>
+            <w:pPr>
+              <w:jc w:val="left"/>
+            </w:pPr>
+            <w:r>
+              <w:rPr>
+                <w:rFonts w:ascii="Courier New" w:hAnsi="Courier New"/>
+                <w:sz w:val="18"/>
+              </w:rPr>
+              <w:t>product</w:t>
+            </w:r>
+            <w:r>
+              <w:rPr>
+                <w:color w:val="373737"/>
+                <w:sz w:val="18"/>
+              </w:rPr>
+              <w:t xml:space="preserve">, </w:t>
+            </w:r>
+            <w:r>
+              <w:rPr>
+                <w:rFonts w:ascii="Courier New" w:hAnsi="Courier New"/>
+                <w:sz w:val="18"/>
+              </w:rPr>
+              <w:t>search</w:t>
+            </w:r>
+            <w:r>
+              <w:rPr>
+                <w:color w:val="373737"/>
+                <w:sz w:val="18"/>
+              </w:rPr>
+              <w:t xml:space="preserve">, </w:t>
+            </w:r>
+            <w:r>
+              <w:rPr>
+                <w:rFonts w:ascii="Courier New" w:hAnsi="Courier New"/>
+                <w:sz w:val="18"/>
+              </w:rPr>
+              <w:t>combination</w:t>
+            </w:r>
+            <w:r>
+              <w:rPr>
+                <w:color w:val="373737"/>
+                <w:sz w:val="18"/>
+              </w:rPr>
+              <w:t xml:space="preserve">, </w:t>
+            </w:r>
+            <w:r>
+              <w:rPr>
+                <w:rFonts w:ascii="Courier New" w:hAnsi="Courier New"/>
+                <w:sz w:val="18"/>
+              </w:rPr>
+              <w:t>sampleV2</w:t>
+            </w:r>
+          </w:p>
+        </w:tc>
+        <w:tc>
+          <w:tcPr>
+            <w:tcW w:type="dxa" w:w="2051"/>
+            <w:vAlign w:val="top"/>
+          </w:tcPr>
+          <w:p>
+            <w:pPr>
+              <w:jc w:val="left"/>
+            </w:pPr>
+            <w:r>
+              <w:rPr>
+                <w:color w:val="373737"/>
+                <w:sz w:val="18"/>
+              </w:rPr>
+              <w:t>products → (product) getProducts(resourceType:'workspaces', resourceId, include*: true); productsCount → (product) getPage totalElements; combinations → (search)…</w:t>
             </w:r>
           </w:p>
         </w:tc>

</xml_diff>